<commit_message>
Nuevas simulaicones y cambios al documento
</commit_message>
<xml_diff>
--- a/Documentos/Plantilla PFM  portada STRUCTURALIA.docx
+++ b/Documentos/Plantilla PFM  portada STRUCTURALIA.docx
@@ -79,8 +79,10 @@
                                 <w:rFonts w:ascii="Ubuntu" w:hAnsi="Ubuntu"/>
                                 <w:sz w:val="24"/>
                               </w:rPr>
-                              <w:t>Braulio Ernesto Prato Melo</w:t>
+                              <w:t>Edson Farid Macias Cifuentes</w:t>
                             </w:r>
+                            <w:bookmarkStart w:id="0" w:name="_GoBack"/>
+                            <w:bookmarkEnd w:id="0"/>
                           </w:p>
                           <w:p>
                             <w:pPr>
@@ -182,8 +184,10 @@
                           <w:rFonts w:ascii="Ubuntu" w:hAnsi="Ubuntu"/>
                           <w:sz w:val="24"/>
                         </w:rPr>
-                        <w:t>Braulio Ernesto Prato Melo</w:t>
+                        <w:t>Edson Farid Macias Cifuentes</w:t>
                       </w:r>
+                      <w:bookmarkStart w:id="1" w:name="_GoBack"/>
+                      <w:bookmarkEnd w:id="1"/>
                     </w:p>
                     <w:p>
                       <w:pPr>
@@ -299,7 +303,7 @@
               </wp:anchor>
             </w:drawing>
           </mc:Choice>
-          <mc:Fallback xmlns:w16sdtfl="http://schemas.microsoft.com/office/word/2024/wordml/sdtformatlock" xmlns:w16sdtdh="http://schemas.microsoft.com/office/word/2020/wordml/sdtdatahash" xmlns:w16du="http://schemas.microsoft.com/office/word/2023/wordml/word16du" xmlns:w16="http://schemas.microsoft.com/office/word/2018/wordml" xmlns:w16cid="http://schemas.microsoft.com/office/word/2016/wordml/cid" xmlns:w16cex="http://schemas.microsoft.com/office/word/2018/wordml/cex" xmlns:oel="http://schemas.microsoft.com/office/2019/extlst" xmlns:am3d="http://schemas.microsoft.com/office/drawing/2017/model3d" xmlns:aink="http://schemas.microsoft.com/office/drawing/2016/ink" xmlns:cx8="http://schemas.microsoft.com/office/drawing/2016/5/14/chartex" xmlns:cx7="http://schemas.microsoft.com/office/drawing/2016/5/13/chartex" xmlns:cx6="http://schemas.microsoft.com/office/drawing/2016/5/12/chartex" xmlns:cx5="http://schemas.microsoft.com/office/drawing/2016/5/11/chartex" xmlns:cx4="http://schemas.microsoft.com/office/drawing/2016/5/10/chartex" xmlns:cx3="http://schemas.microsoft.com/office/drawing/2016/5/9/chartex" xmlns:cx2="http://schemas.microsoft.com/office/drawing/2015/10/21/chartex" xmlns:cx1="http://schemas.microsoft.com/office/drawing/2015/9/8/chartex">
+          <mc:Fallback xmlns:cx1="http://schemas.microsoft.com/office/drawing/2015/9/8/chartex" xmlns:cx2="http://schemas.microsoft.com/office/drawing/2015/10/21/chartex" xmlns:cx3="http://schemas.microsoft.com/office/drawing/2016/5/9/chartex" xmlns:cx4="http://schemas.microsoft.com/office/drawing/2016/5/10/chartex" xmlns:cx5="http://schemas.microsoft.com/office/drawing/2016/5/11/chartex" xmlns:cx6="http://schemas.microsoft.com/office/drawing/2016/5/12/chartex" xmlns:cx7="http://schemas.microsoft.com/office/drawing/2016/5/13/chartex" xmlns:cx8="http://schemas.microsoft.com/office/drawing/2016/5/14/chartex" xmlns:aink="http://schemas.microsoft.com/office/drawing/2016/ink" xmlns:am3d="http://schemas.microsoft.com/office/drawing/2017/model3d" xmlns:oel="http://schemas.microsoft.com/office/2019/extlst" xmlns:w16cex="http://schemas.microsoft.com/office/word/2018/wordml/cex" xmlns:w16cid="http://schemas.microsoft.com/office/word/2016/wordml/cid" xmlns:w16="http://schemas.microsoft.com/office/word/2018/wordml" xmlns:w16du="http://schemas.microsoft.com/office/word/2023/wordml/word16du" xmlns:w16sdtdh="http://schemas.microsoft.com/office/word/2020/wordml/sdtdatahash" xmlns:w16sdtfl="http://schemas.microsoft.com/office/word/2024/wordml/sdtformatlock">
             <w:pict>
               <v:rect w14:anchorId="4C829DAB" id="Rectángulo 408" o:spid="_x0000_s1026" style="position:absolute;margin-left:-.05pt;margin-top:173.95pt;width:318pt;height:3.6pt;z-index:251667456;visibility:visible;mso-wrap-style:square;mso-wrap-distance-left:9pt;mso-wrap-distance-top:0;mso-wrap-distance-right:9pt;mso-wrap-distance-bottom:0;mso-position-horizontal:absolute;mso-position-horizontal-relative:margin;mso-position-vertical:absolute;mso-position-vertical-relative:text;v-text-anchor:middle" o:gfxdata="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" fillcolor="#b0b0b0" stroked="f" strokeweight="1pt">
                 <w10:wrap anchorx="margin"/>
@@ -353,7 +357,7 @@
                     <a:blip r:embed="rId7">
                       <a:extLst>
                         <a:ext uri="{96DAC541-7B7A-43D3-8B79-37D633B846F1}">
-                          <asvg:svgBlip xmlns:asvg="http://schemas.microsoft.com/office/drawing/2016/SVG/main" xmlns:w16sdtfl="http://schemas.microsoft.com/office/word/2024/wordml/sdtformatlock" xmlns:w16sdtdh="http://schemas.microsoft.com/office/word/2020/wordml/sdtdatahash" xmlns:w16du="http://schemas.microsoft.com/office/word/2023/wordml/word16du" xmlns:w16="http://schemas.microsoft.com/office/word/2018/wordml" xmlns:w16cid="http://schemas.microsoft.com/office/word/2016/wordml/cid" xmlns:w16cex="http://schemas.microsoft.com/office/word/2018/wordml/cex" xmlns:w="http://schemas.openxmlformats.org/wordprocessingml/2006/main" xmlns:w10="urn:schemas-microsoft-com:office:word" xmlns:v="urn:schemas-microsoft-com:vml" xmlns:oel="http://schemas.microsoft.com/office/2019/extlst" xmlns:o="urn:schemas-microsoft-com:office:office" xmlns:am3d="http://schemas.microsoft.com/office/drawing/2017/model3d" xmlns:aink="http://schemas.microsoft.com/office/drawing/2016/ink" xmlns:cx8="http://schemas.microsoft.com/office/drawing/2016/5/14/chartex" xmlns:cx7="http://schemas.microsoft.com/office/drawing/2016/5/13/chartex" xmlns:cx6="http://schemas.microsoft.com/office/drawing/2016/5/12/chartex" xmlns:cx5="http://schemas.microsoft.com/office/drawing/2016/5/11/chartex" xmlns:cx4="http://schemas.microsoft.com/office/drawing/2016/5/10/chartex" xmlns:cx3="http://schemas.microsoft.com/office/drawing/2016/5/9/chartex" xmlns:cx2="http://schemas.microsoft.com/office/drawing/2015/10/21/chartex" xmlns:cx1="http://schemas.microsoft.com/office/drawing/2015/9/8/chartex" xmlns="" r:embed="rId8"/>
+                          <asvg:svgBlip xmlns="" xmlns:cx1="http://schemas.microsoft.com/office/drawing/2015/9/8/chartex" xmlns:cx2="http://schemas.microsoft.com/office/drawing/2015/10/21/chartex" xmlns:cx3="http://schemas.microsoft.com/office/drawing/2016/5/9/chartex" xmlns:cx4="http://schemas.microsoft.com/office/drawing/2016/5/10/chartex" xmlns:cx5="http://schemas.microsoft.com/office/drawing/2016/5/11/chartex" xmlns:cx6="http://schemas.microsoft.com/office/drawing/2016/5/12/chartex" xmlns:cx7="http://schemas.microsoft.com/office/drawing/2016/5/13/chartex" xmlns:cx8="http://schemas.microsoft.com/office/drawing/2016/5/14/chartex" xmlns:aink="http://schemas.microsoft.com/office/drawing/2016/ink" xmlns:am3d="http://schemas.microsoft.com/office/drawing/2017/model3d" xmlns:o="urn:schemas-microsoft-com:office:office" xmlns:oel="http://schemas.microsoft.com/office/2019/extlst" xmlns:v="urn:schemas-microsoft-com:vml" xmlns:w10="urn:schemas-microsoft-com:office:word" xmlns:w="http://schemas.openxmlformats.org/wordprocessingml/2006/main" xmlns:w16cex="http://schemas.microsoft.com/office/word/2018/wordml/cex" xmlns:w16cid="http://schemas.microsoft.com/office/word/2016/wordml/cid" xmlns:w16="http://schemas.microsoft.com/office/word/2018/wordml" xmlns:w16du="http://schemas.microsoft.com/office/word/2023/wordml/word16du" xmlns:w16sdtdh="http://schemas.microsoft.com/office/word/2020/wordml/sdtdatahash" xmlns:w16sdtfl="http://schemas.microsoft.com/office/word/2024/wordml/sdtformatlock" xmlns:asvg="http://schemas.microsoft.com/office/drawing/2016/SVG/main" r:embed="rId8"/>
                         </a:ext>
                       </a:extLst>
                     </a:blip>
@@ -621,7 +625,7 @@
               </wp:anchor>
             </w:drawing>
           </mc:Choice>
-          <mc:Fallback xmlns:w16sdtfl="http://schemas.microsoft.com/office/word/2024/wordml/sdtformatlock" xmlns:w16sdtdh="http://schemas.microsoft.com/office/word/2020/wordml/sdtdatahash" xmlns:w16du="http://schemas.microsoft.com/office/word/2023/wordml/word16du" xmlns:w16="http://schemas.microsoft.com/office/word/2018/wordml" xmlns:w16cid="http://schemas.microsoft.com/office/word/2016/wordml/cid" xmlns:w16cex="http://schemas.microsoft.com/office/word/2018/wordml/cex" xmlns:oel="http://schemas.microsoft.com/office/2019/extlst" xmlns:am3d="http://schemas.microsoft.com/office/drawing/2017/model3d" xmlns:aink="http://schemas.microsoft.com/office/drawing/2016/ink" xmlns:cx8="http://schemas.microsoft.com/office/drawing/2016/5/14/chartex" xmlns:cx7="http://schemas.microsoft.com/office/drawing/2016/5/13/chartex" xmlns:cx6="http://schemas.microsoft.com/office/drawing/2016/5/12/chartex" xmlns:cx5="http://schemas.microsoft.com/office/drawing/2016/5/11/chartex" xmlns:cx4="http://schemas.microsoft.com/office/drawing/2016/5/10/chartex" xmlns:cx3="http://schemas.microsoft.com/office/drawing/2016/5/9/chartex" xmlns:cx2="http://schemas.microsoft.com/office/drawing/2015/10/21/chartex" xmlns:cx1="http://schemas.microsoft.com/office/drawing/2015/9/8/chartex">
+          <mc:Fallback xmlns:cx1="http://schemas.microsoft.com/office/drawing/2015/9/8/chartex" xmlns:cx2="http://schemas.microsoft.com/office/drawing/2015/10/21/chartex" xmlns:cx3="http://schemas.microsoft.com/office/drawing/2016/5/9/chartex" xmlns:cx4="http://schemas.microsoft.com/office/drawing/2016/5/10/chartex" xmlns:cx5="http://schemas.microsoft.com/office/drawing/2016/5/11/chartex" xmlns:cx6="http://schemas.microsoft.com/office/drawing/2016/5/12/chartex" xmlns:cx7="http://schemas.microsoft.com/office/drawing/2016/5/13/chartex" xmlns:cx8="http://schemas.microsoft.com/office/drawing/2016/5/14/chartex" xmlns:aink="http://schemas.microsoft.com/office/drawing/2016/ink" xmlns:am3d="http://schemas.microsoft.com/office/drawing/2017/model3d" xmlns:oel="http://schemas.microsoft.com/office/2019/extlst" xmlns:w16cex="http://schemas.microsoft.com/office/word/2018/wordml/cex" xmlns:w16cid="http://schemas.microsoft.com/office/word/2016/wordml/cid" xmlns:w16="http://schemas.microsoft.com/office/word/2018/wordml" xmlns:w16du="http://schemas.microsoft.com/office/word/2023/wordml/word16du" xmlns:w16sdtdh="http://schemas.microsoft.com/office/word/2020/wordml/sdtdatahash" xmlns:w16sdtfl="http://schemas.microsoft.com/office/word/2024/wordml/sdtformatlock">
             <w:pict>
               <v:rect w14:anchorId="6E97A0CD" id="Rectangle 22" o:spid="_x0000_s1026" style="position:absolute;margin-left:0;margin-top:367.25pt;width:490.8pt;height:363.45pt;z-index:251663360;visibility:visible;mso-wrap-style:square;mso-width-percent:0;mso-height-percent:0;mso-wrap-distance-left:9pt;mso-wrap-distance-top:0;mso-wrap-distance-right:9pt;mso-wrap-distance-bottom:0;mso-position-horizontal:left;mso-position-horizontal-relative:margin;mso-position-vertical:absolute;mso-position-vertical-relative:text;mso-width-percent:0;mso-height-percent:0;mso-width-relative:margin;mso-height-relative:margin;v-text-anchor:middle" o:gfxdata="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" stroked="f" strokeweight="1pt">
                 <v:fill r:id="rId10" o:title="" recolor="t" rotate="t" type="frame"/>
@@ -734,7 +738,7 @@
               </wp:anchor>
             </w:drawing>
           </mc:Choice>
-          <mc:Fallback xmlns:w16sdtfl="http://schemas.microsoft.com/office/word/2024/wordml/sdtformatlock" xmlns:w16sdtdh="http://schemas.microsoft.com/office/word/2020/wordml/sdtdatahash" xmlns:w16du="http://schemas.microsoft.com/office/word/2023/wordml/word16du" xmlns:w16="http://schemas.microsoft.com/office/word/2018/wordml" xmlns:w16cid="http://schemas.microsoft.com/office/word/2016/wordml/cid" xmlns:w16cex="http://schemas.microsoft.com/office/word/2018/wordml/cex" xmlns:oel="http://schemas.microsoft.com/office/2019/extlst" xmlns:am3d="http://schemas.microsoft.com/office/drawing/2017/model3d" xmlns:aink="http://schemas.microsoft.com/office/drawing/2016/ink" xmlns:cx8="http://schemas.microsoft.com/office/drawing/2016/5/14/chartex" xmlns:cx7="http://schemas.microsoft.com/office/drawing/2016/5/13/chartex" xmlns:cx6="http://schemas.microsoft.com/office/drawing/2016/5/12/chartex" xmlns:cx5="http://schemas.microsoft.com/office/drawing/2016/5/11/chartex" xmlns:cx4="http://schemas.microsoft.com/office/drawing/2016/5/10/chartex" xmlns:cx3="http://schemas.microsoft.com/office/drawing/2016/5/9/chartex" xmlns:cx2="http://schemas.microsoft.com/office/drawing/2015/10/21/chartex" xmlns:cx1="http://schemas.microsoft.com/office/drawing/2015/9/8/chartex">
+          <mc:Fallback xmlns:cx1="http://schemas.microsoft.com/office/drawing/2015/9/8/chartex" xmlns:cx2="http://schemas.microsoft.com/office/drawing/2015/10/21/chartex" xmlns:cx3="http://schemas.microsoft.com/office/drawing/2016/5/9/chartex" xmlns:cx4="http://schemas.microsoft.com/office/drawing/2016/5/10/chartex" xmlns:cx5="http://schemas.microsoft.com/office/drawing/2016/5/11/chartex" xmlns:cx6="http://schemas.microsoft.com/office/drawing/2016/5/12/chartex" xmlns:cx7="http://schemas.microsoft.com/office/drawing/2016/5/13/chartex" xmlns:cx8="http://schemas.microsoft.com/office/drawing/2016/5/14/chartex" xmlns:aink="http://schemas.microsoft.com/office/drawing/2016/ink" xmlns:am3d="http://schemas.microsoft.com/office/drawing/2017/model3d" xmlns:oel="http://schemas.microsoft.com/office/2019/extlst" xmlns:w16cex="http://schemas.microsoft.com/office/word/2018/wordml/cex" xmlns:w16cid="http://schemas.microsoft.com/office/word/2016/wordml/cid" xmlns:w16="http://schemas.microsoft.com/office/word/2018/wordml" xmlns:w16du="http://schemas.microsoft.com/office/word/2023/wordml/word16du" xmlns:w16sdtdh="http://schemas.microsoft.com/office/word/2020/wordml/sdtdatahash" xmlns:w16sdtfl="http://schemas.microsoft.com/office/word/2024/wordml/sdtformatlock">
             <w:pict>
               <v:shape w14:anchorId="3CA2F0C8" id="Freeform 21" o:spid="_x0000_s1026" style="position:absolute;margin-left:44.95pt;margin-top:281.5pt;width:507.6pt;height:523.7pt;z-index:-251654144;visibility:visible;mso-wrap-style:square;mso-width-percent:0;mso-height-percent:0;mso-wrap-distance-left:9pt;mso-wrap-distance-top:0;mso-wrap-distance-right:9pt;mso-wrap-distance-bottom:0;mso-position-horizontal:absolute;mso-position-horizontal-relative:text;mso-position-vertical:absolute;mso-position-vertical-relative:text;mso-width-percent:0;mso-height-percent:0;mso-width-relative:margin;mso-height-relative:margin;v-text-anchor:middle" coordsize="1176354,2251040" o:gfxdata="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" path="m,2251041r1176355,l1176355,,,2251041xe" fillcolor="#4d4c4c" stroked="f" strokeweight=".26403mm">
                 <v:stroke joinstyle="miter"/>
@@ -857,7 +861,7 @@
               </wp:anchor>
             </w:drawing>
           </mc:Choice>
-          <mc:Fallback xmlns:w16sdtfl="http://schemas.microsoft.com/office/word/2024/wordml/sdtformatlock" xmlns:w16sdtdh="http://schemas.microsoft.com/office/word/2020/wordml/sdtdatahash" xmlns:w16du="http://schemas.microsoft.com/office/word/2023/wordml/word16du" xmlns:w16="http://schemas.microsoft.com/office/word/2018/wordml" xmlns:w16cid="http://schemas.microsoft.com/office/word/2016/wordml/cid" xmlns:w16cex="http://schemas.microsoft.com/office/word/2018/wordml/cex" xmlns:oel="http://schemas.microsoft.com/office/2019/extlst" xmlns:am3d="http://schemas.microsoft.com/office/drawing/2017/model3d" xmlns:aink="http://schemas.microsoft.com/office/drawing/2016/ink" xmlns:cx8="http://schemas.microsoft.com/office/drawing/2016/5/14/chartex" xmlns:cx7="http://schemas.microsoft.com/office/drawing/2016/5/13/chartex" xmlns:cx6="http://schemas.microsoft.com/office/drawing/2016/5/12/chartex" xmlns:cx5="http://schemas.microsoft.com/office/drawing/2016/5/11/chartex" xmlns:cx4="http://schemas.microsoft.com/office/drawing/2016/5/10/chartex" xmlns:cx3="http://schemas.microsoft.com/office/drawing/2016/5/9/chartex" xmlns:cx2="http://schemas.microsoft.com/office/drawing/2015/10/21/chartex" xmlns:cx1="http://schemas.microsoft.com/office/drawing/2015/9/8/chartex">
+          <mc:Fallback xmlns:cx1="http://schemas.microsoft.com/office/drawing/2015/9/8/chartex" xmlns:cx2="http://schemas.microsoft.com/office/drawing/2015/10/21/chartex" xmlns:cx3="http://schemas.microsoft.com/office/drawing/2016/5/9/chartex" xmlns:cx4="http://schemas.microsoft.com/office/drawing/2016/5/10/chartex" xmlns:cx5="http://schemas.microsoft.com/office/drawing/2016/5/11/chartex" xmlns:cx6="http://schemas.microsoft.com/office/drawing/2016/5/12/chartex" xmlns:cx7="http://schemas.microsoft.com/office/drawing/2016/5/13/chartex" xmlns:cx8="http://schemas.microsoft.com/office/drawing/2016/5/14/chartex" xmlns:aink="http://schemas.microsoft.com/office/drawing/2016/ink" xmlns:am3d="http://schemas.microsoft.com/office/drawing/2017/model3d" xmlns:oel="http://schemas.microsoft.com/office/2019/extlst" xmlns:w16cex="http://schemas.microsoft.com/office/word/2018/wordml/cex" xmlns:w16cid="http://schemas.microsoft.com/office/word/2016/wordml/cid" xmlns:w16="http://schemas.microsoft.com/office/word/2018/wordml" xmlns:w16du="http://schemas.microsoft.com/office/word/2023/wordml/word16du" xmlns:w16sdtdh="http://schemas.microsoft.com/office/word/2020/wordml/sdtdatahash" xmlns:w16sdtfl="http://schemas.microsoft.com/office/word/2024/wordml/sdtformatlock">
             <w:pict>
               <v:shape w14:anchorId="14504D4F" id="Freeform 18" o:spid="_x0000_s1026" style="position:absolute;margin-left:416.05pt;margin-top:174.95pt;width:467.25pt;height:656.8pt;z-index:-251656192;visibility:visible;mso-wrap-style:square;mso-wrap-distance-left:9pt;mso-wrap-distance-top:0;mso-wrap-distance-right:9pt;mso-wrap-distance-bottom:0;mso-position-horizontal:right;mso-position-horizontal-relative:margin;mso-position-vertical:absolute;mso-position-vertical-relative:text;v-text-anchor:middle" coordsize="4446427,6246497" o:gfxdata="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" path="m3125111,l1314368,3618461,,6246498r4446428,l4446428,,3125111,xe" fillcolor="#6f6f6e" stroked="f" strokeweight=".26403mm">
                 <v:stroke joinstyle="miter"/>
@@ -987,7 +991,7 @@
               </wp:anchor>
             </w:drawing>
           </mc:Choice>
-          <mc:Fallback xmlns:w16sdtfl="http://schemas.microsoft.com/office/word/2024/wordml/sdtformatlock" xmlns:w16sdtdh="http://schemas.microsoft.com/office/word/2020/wordml/sdtdatahash" xmlns:w16du="http://schemas.microsoft.com/office/word/2023/wordml/word16du" xmlns:w16="http://schemas.microsoft.com/office/word/2018/wordml" xmlns:w16cid="http://schemas.microsoft.com/office/word/2016/wordml/cid" xmlns:w16cex="http://schemas.microsoft.com/office/word/2018/wordml/cex" xmlns:oel="http://schemas.microsoft.com/office/2019/extlst" xmlns:am3d="http://schemas.microsoft.com/office/drawing/2017/model3d" xmlns:aink="http://schemas.microsoft.com/office/drawing/2016/ink" xmlns:cx8="http://schemas.microsoft.com/office/drawing/2016/5/14/chartex" xmlns:cx7="http://schemas.microsoft.com/office/drawing/2016/5/13/chartex" xmlns:cx6="http://schemas.microsoft.com/office/drawing/2016/5/12/chartex" xmlns:cx5="http://schemas.microsoft.com/office/drawing/2016/5/11/chartex" xmlns:cx4="http://schemas.microsoft.com/office/drawing/2016/5/10/chartex" xmlns:cx3="http://schemas.microsoft.com/office/drawing/2016/5/9/chartex" xmlns:cx2="http://schemas.microsoft.com/office/drawing/2015/10/21/chartex" xmlns:cx1="http://schemas.microsoft.com/office/drawing/2015/9/8/chartex">
+          <mc:Fallback xmlns:cx1="http://schemas.microsoft.com/office/drawing/2015/9/8/chartex" xmlns:cx2="http://schemas.microsoft.com/office/drawing/2015/10/21/chartex" xmlns:cx3="http://schemas.microsoft.com/office/drawing/2016/5/9/chartex" xmlns:cx4="http://schemas.microsoft.com/office/drawing/2016/5/10/chartex" xmlns:cx5="http://schemas.microsoft.com/office/drawing/2016/5/11/chartex" xmlns:cx6="http://schemas.microsoft.com/office/drawing/2016/5/12/chartex" xmlns:cx7="http://schemas.microsoft.com/office/drawing/2016/5/13/chartex" xmlns:cx8="http://schemas.microsoft.com/office/drawing/2016/5/14/chartex" xmlns:aink="http://schemas.microsoft.com/office/drawing/2016/ink" xmlns:am3d="http://schemas.microsoft.com/office/drawing/2017/model3d" xmlns:oel="http://schemas.microsoft.com/office/2019/extlst" xmlns:w16cex="http://schemas.microsoft.com/office/word/2018/wordml/cex" xmlns:w16cid="http://schemas.microsoft.com/office/word/2016/wordml/cid" xmlns:w16="http://schemas.microsoft.com/office/word/2018/wordml" xmlns:w16du="http://schemas.microsoft.com/office/word/2023/wordml/word16du" xmlns:w16sdtdh="http://schemas.microsoft.com/office/word/2020/wordml/sdtdatahash" xmlns:w16sdtfl="http://schemas.microsoft.com/office/word/2024/wordml/sdtformatlock">
             <w:pict>
               <v:shape w14:anchorId="7A465EF5" id="Freeform 19" o:spid="_x0000_s1026" style="position:absolute;margin-left:284.9pt;margin-top:-51.05pt;width:418.45pt;height:424.05pt;z-index:-251655168;visibility:visible;mso-wrap-style:square;mso-width-percent:0;mso-height-percent:0;mso-wrap-distance-left:9pt;mso-wrap-distance-top:0;mso-wrap-distance-right:9pt;mso-wrap-distance-bottom:0;mso-position-horizontal:absolute;mso-position-horizontal-relative:text;mso-position-vertical:absolute;mso-position-vertical-relative:text;mso-width-percent:0;mso-height-percent:0;mso-width-relative:margin;mso-height-relative:margin;v-text-anchor:middle" coordsize="2493007,2337491" o:gfxdata="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" path="m1171691,l,2337491r1661117,l2493007,738776,2493007,,1171691,xe" fillcolor="#b0b0b0" stroked="f" strokeweight=".26403mm">
                 <v:stroke joinstyle="miter"/>
@@ -1236,14 +1240,12 @@
         <w:spacing w:after="0" w:line="300" w:lineRule="exact"/>
         <w:rPr>
           <w:rFonts w:ascii="Calibri" w:eastAsia="Times New Roman" w:hAnsi="Calibri" w:cs="Arial"/>
-          <w:highlight w:val="green"/>
-          <w:lang w:eastAsia="es-ES"/>
-        </w:rPr>
-      </w:pPr>
-      <w:r>
-        <w:rPr>
-          <w:rFonts w:ascii="Calibri" w:eastAsia="Times New Roman" w:hAnsi="Calibri" w:cs="Arial"/>
-          <w:highlight w:val="green"/>
+          <w:lang w:eastAsia="es-ES"/>
+        </w:rPr>
+      </w:pPr>
+      <w:r>
+        <w:rPr>
+          <w:rFonts w:ascii="Calibri" w:eastAsia="Times New Roman" w:hAnsi="Calibri" w:cs="Arial"/>
           <w:lang w:eastAsia="es-ES"/>
         </w:rPr>
         <w:t>Resumen y palabras clave</w:t>
@@ -1251,7 +1253,6 @@
       <w:r>
         <w:rPr>
           <w:rFonts w:ascii="Calibri" w:eastAsia="Times New Roman" w:hAnsi="Calibri" w:cs="Arial"/>
-          <w:highlight w:val="green"/>
           <w:lang w:eastAsia="es-ES"/>
         </w:rPr>
         <w:tab/>
@@ -1266,14 +1267,12 @@
         <w:spacing w:after="0" w:line="300" w:lineRule="exact"/>
         <w:rPr>
           <w:rFonts w:ascii="Calibri" w:eastAsia="Times New Roman" w:hAnsi="Calibri" w:cs="Arial"/>
-          <w:highlight w:val="green"/>
-          <w:lang w:eastAsia="es-ES"/>
-        </w:rPr>
-      </w:pPr>
-      <w:r>
-        <w:rPr>
-          <w:rFonts w:ascii="Calibri" w:eastAsia="Times New Roman" w:hAnsi="Calibri" w:cs="Arial"/>
-          <w:highlight w:val="green"/>
+          <w:lang w:eastAsia="es-ES"/>
+        </w:rPr>
+      </w:pPr>
+      <w:r>
+        <w:rPr>
+          <w:rFonts w:ascii="Calibri" w:eastAsia="Times New Roman" w:hAnsi="Calibri" w:cs="Arial"/>
           <w:lang w:eastAsia="es-ES"/>
         </w:rPr>
         <w:t>Introducción</w:t>
@@ -1281,7 +1280,6 @@
       <w:r>
         <w:rPr>
           <w:rFonts w:ascii="Calibri" w:eastAsia="Times New Roman" w:hAnsi="Calibri" w:cs="Arial"/>
-          <w:highlight w:val="green"/>
           <w:lang w:eastAsia="es-ES"/>
         </w:rPr>
         <w:tab/>
@@ -1302,7 +1300,6 @@
       <w:r>
         <w:rPr>
           <w:rFonts w:ascii="Calibri" w:eastAsia="Times New Roman" w:hAnsi="Calibri" w:cs="Arial"/>
-          <w:highlight w:val="green"/>
           <w:lang w:eastAsia="es-ES"/>
         </w:rPr>
         <w:t>Objetivos</w:t>
@@ -1310,7 +1307,6 @@
       <w:r>
         <w:rPr>
           <w:rFonts w:ascii="Calibri" w:eastAsia="Times New Roman" w:hAnsi="Calibri" w:cs="Arial"/>
-          <w:highlight w:val="green"/>
           <w:lang w:eastAsia="es-ES"/>
         </w:rPr>
         <w:tab/>
@@ -1331,7 +1327,6 @@
       <w:r>
         <w:rPr>
           <w:rFonts w:ascii="Calibri" w:eastAsia="Times New Roman" w:hAnsi="Calibri" w:cs="Arial"/>
-          <w:highlight w:val="green"/>
           <w:lang w:eastAsia="es-ES"/>
         </w:rPr>
         <w:t>Metodología</w:t>
@@ -1339,7 +1334,6 @@
       <w:r>
         <w:rPr>
           <w:rFonts w:ascii="Calibri" w:eastAsia="Times New Roman" w:hAnsi="Calibri" w:cs="Arial"/>
-          <w:highlight w:val="green"/>
           <w:lang w:eastAsia="es-ES"/>
         </w:rPr>
         <w:tab/>
@@ -1374,7 +1368,14 @@
           <w:rFonts w:ascii="Calibri" w:eastAsia="Times New Roman" w:hAnsi="Calibri" w:cs="Arial"/>
           <w:lang w:eastAsia="es-ES"/>
         </w:rPr>
-        <w:t>1. Capítulo 1</w:t>
+        <w:t xml:space="preserve">1. </w:t>
+      </w:r>
+      <w:r>
+        <w:rPr>
+          <w:rFonts w:ascii="Calibri" w:eastAsia="Times New Roman" w:hAnsi="Calibri" w:cs="Arial"/>
+          <w:lang w:eastAsia="es-ES"/>
+        </w:rPr>
+        <w:t>MARCO TEÓRICO Y ESTADO DEL ARTE</w:t>
       </w:r>
       <w:r>
         <w:rPr>
@@ -1402,7 +1403,14 @@
           <w:rFonts w:ascii="Calibri" w:eastAsia="Times New Roman" w:hAnsi="Calibri" w:cs="Arial"/>
           <w:lang w:eastAsia="es-ES"/>
         </w:rPr>
-        <w:t>1.1. Sección 1</w:t>
+        <w:t xml:space="preserve">1.1. </w:t>
+      </w:r>
+      <w:r>
+        <w:rPr>
+          <w:rFonts w:ascii="Calibri" w:eastAsia="Times New Roman" w:hAnsi="Calibri" w:cs="Arial"/>
+          <w:lang w:eastAsia="es-ES"/>
+        </w:rPr>
+        <w:t>La amenaza UAS de baja altitud</w:t>
       </w:r>
       <w:r>
         <w:rPr>
@@ -1411,6 +1419,133 @@
         </w:rPr>
         <w:tab/>
         <w:t>nº</w:t>
+      </w:r>
+    </w:p>
+    <w:p>
+      <w:pPr>
+        <w:tabs>
+          <w:tab w:val="left" w:leader="dot" w:pos="7080"/>
+        </w:tabs>
+        <w:spacing w:after="0" w:line="300" w:lineRule="exact"/>
+        <w:ind w:left="1416"/>
+        <w:rPr>
+          <w:rFonts w:ascii="Calibri" w:eastAsia="Times New Roman" w:hAnsi="Calibri" w:cs="Arial"/>
+          <w:lang w:eastAsia="es-ES"/>
+        </w:rPr>
+      </w:pPr>
+      <w:r>
+        <w:rPr>
+          <w:rFonts w:ascii="Calibri" w:eastAsia="Times New Roman" w:hAnsi="Calibri" w:cs="Arial"/>
+          <w:lang w:eastAsia="es-ES"/>
+        </w:rPr>
+        <w:t>1.1.1.</w:t>
+      </w:r>
+      <w:r>
+        <w:rPr>
+          <w:rFonts w:ascii="Calibri" w:eastAsia="Times New Roman" w:hAnsi="Calibri" w:cs="Arial"/>
+          <w:lang w:eastAsia="es-ES"/>
+        </w:rPr>
+        <w:t xml:space="preserve"> </w:t>
+      </w:r>
+      <w:r>
+        <w:rPr>
+          <w:rFonts w:ascii="Calibri" w:eastAsia="Times New Roman" w:hAnsi="Calibri" w:cs="Arial"/>
+          <w:lang w:eastAsia="es-ES"/>
+        </w:rPr>
+        <w:t>Clasificación de los sistemas aéreos no tripulados</w:t>
+      </w:r>
+      <w:r>
+        <w:rPr>
+          <w:rFonts w:ascii="Calibri" w:eastAsia="Times New Roman" w:hAnsi="Calibri" w:cs="Arial"/>
+          <w:lang w:eastAsia="es-ES"/>
+        </w:rPr>
+        <w:tab/>
+        <w:t>No</w:t>
+      </w:r>
+    </w:p>
+    <w:p>
+      <w:pPr>
+        <w:tabs>
+          <w:tab w:val="left" w:leader="dot" w:pos="7080"/>
+        </w:tabs>
+        <w:spacing w:after="0" w:line="300" w:lineRule="exact"/>
+        <w:ind w:left="1416"/>
+        <w:rPr>
+          <w:rFonts w:ascii="Calibri" w:eastAsia="Times New Roman" w:hAnsi="Calibri" w:cs="Arial"/>
+          <w:lang w:eastAsia="es-ES"/>
+        </w:rPr>
+      </w:pPr>
+      <w:r>
+        <w:rPr>
+          <w:rFonts w:ascii="Calibri" w:eastAsia="Times New Roman" w:hAnsi="Calibri" w:cs="Arial"/>
+          <w:lang w:eastAsia="es-ES"/>
+        </w:rPr>
+        <w:t>1.1.2.</w:t>
+      </w:r>
+      <w:r>
+        <w:rPr>
+          <w:rFonts w:ascii="Calibri" w:eastAsia="Times New Roman" w:hAnsi="Calibri" w:cs="Arial"/>
+          <w:lang w:eastAsia="es-ES"/>
+        </w:rPr>
+        <w:t>Tipología de la amenaza</w:t>
+      </w:r>
+      <w:r>
+        <w:rPr>
+          <w:rFonts w:ascii="Calibri" w:eastAsia="Times New Roman" w:hAnsi="Calibri" w:cs="Arial"/>
+          <w:lang w:eastAsia="es-ES"/>
+        </w:rPr>
+        <w:t xml:space="preserve"> </w:t>
+      </w:r>
+      <w:r>
+        <w:rPr>
+          <w:rFonts w:ascii="Calibri" w:eastAsia="Times New Roman" w:hAnsi="Calibri" w:cs="Arial"/>
+          <w:lang w:eastAsia="es-ES"/>
+        </w:rPr>
+        <w:tab/>
+      </w:r>
+    </w:p>
+    <w:p>
+      <w:pPr>
+        <w:tabs>
+          <w:tab w:val="left" w:leader="dot" w:pos="7080"/>
+        </w:tabs>
+        <w:spacing w:after="0" w:line="300" w:lineRule="exact"/>
+        <w:ind w:left="1416"/>
+        <w:rPr>
+          <w:rFonts w:ascii="Calibri" w:eastAsia="Times New Roman" w:hAnsi="Calibri" w:cs="Arial"/>
+          <w:lang w:eastAsia="es-ES"/>
+        </w:rPr>
+      </w:pPr>
+      <w:r>
+        <w:rPr>
+          <w:rFonts w:ascii="Calibri" w:eastAsia="Times New Roman" w:hAnsi="Calibri" w:cs="Arial"/>
+          <w:lang w:eastAsia="es-ES"/>
+        </w:rPr>
+        <w:t>1.2.3.</w:t>
+      </w:r>
+      <w:r>
+        <w:t xml:space="preserve"> </w:t>
+      </w:r>
+      <w:r>
+        <w:rPr>
+          <w:rFonts w:ascii="Calibri" w:eastAsia="Times New Roman" w:hAnsi="Calibri" w:cs="Arial"/>
+          <w:lang w:eastAsia="es-ES"/>
+        </w:rPr>
+        <w:t>El caso colombiano</w:t>
+      </w:r>
+      <w:r>
+        <w:rPr>
+          <w:rFonts w:ascii="Calibri" w:eastAsia="Times New Roman" w:hAnsi="Calibri" w:cs="Arial"/>
+          <w:lang w:eastAsia="es-ES"/>
+        </w:rPr>
+        <w:t xml:space="preserve"> </w:t>
+      </w:r>
+      <w:r>
+        <w:rPr>
+          <w:rFonts w:ascii="Calibri" w:eastAsia="Times New Roman" w:hAnsi="Calibri" w:cs="Arial"/>
+          <w:lang w:eastAsia="es-ES"/>
+        </w:rPr>
+        <w:tab/>
       </w:r>
     </w:p>
     <w:p>
@@ -1430,7 +1565,14 @@
           <w:rFonts w:ascii="Calibri" w:eastAsia="Times New Roman" w:hAnsi="Calibri" w:cs="Arial"/>
           <w:lang w:eastAsia="es-ES"/>
         </w:rPr>
-        <w:t>1.2. Sección 2</w:t>
+        <w:t xml:space="preserve">1.2. </w:t>
+      </w:r>
+      <w:r>
+        <w:rPr>
+          <w:rFonts w:ascii="Calibri" w:eastAsia="Times New Roman" w:hAnsi="Calibri" w:cs="Arial"/>
+          <w:lang w:eastAsia="es-ES"/>
+        </w:rPr>
+        <w:t>Sistemas C-UAS: taxonomía y defensa por capas</w:t>
       </w:r>
       <w:r>
         <w:rPr>
@@ -1458,7 +1600,14 @@
           <w:rFonts w:ascii="Calibri" w:eastAsia="Times New Roman" w:hAnsi="Calibri" w:cs="Arial"/>
           <w:lang w:eastAsia="es-ES"/>
         </w:rPr>
-        <w:t>1.2.1. Subsección 1</w:t>
+        <w:t xml:space="preserve">1.2.1. </w:t>
+      </w:r>
+      <w:r>
+        <w:rPr>
+          <w:rFonts w:ascii="Calibri" w:eastAsia="Times New Roman" w:hAnsi="Calibri" w:cs="Arial"/>
+          <w:lang w:eastAsia="es-ES"/>
+        </w:rPr>
+        <w:t>Sistemas de detección en C-UAS</w:t>
       </w:r>
       <w:r>
         <w:rPr>
@@ -1486,7 +1635,14 @@
           <w:rFonts w:ascii="Calibri" w:eastAsia="Times New Roman" w:hAnsi="Calibri" w:cs="Arial"/>
           <w:lang w:eastAsia="es-ES"/>
         </w:rPr>
-        <w:t>1.2.2. Subsección 2</w:t>
+        <w:t xml:space="preserve">1.2.2. </w:t>
+      </w:r>
+      <w:r>
+        <w:rPr>
+          <w:rFonts w:ascii="Calibri" w:eastAsia="Times New Roman" w:hAnsi="Calibri" w:cs="Arial"/>
+          <w:lang w:eastAsia="es-ES"/>
+        </w:rPr>
+        <w:t>Sistemas de inhibición y neutralización</w:t>
       </w:r>
       <w:r>
         <w:rPr>
@@ -1503,17 +1659,245 @@
           <w:tab w:val="left" w:leader="dot" w:pos="7080"/>
         </w:tabs>
         <w:spacing w:after="0" w:line="300" w:lineRule="exact"/>
-        <w:rPr>
-          <w:rFonts w:ascii="Calibri" w:eastAsia="Times New Roman" w:hAnsi="Calibri" w:cs="Arial"/>
-          <w:lang w:eastAsia="es-ES"/>
-        </w:rPr>
-      </w:pPr>
-      <w:r>
-        <w:rPr>
-          <w:rFonts w:ascii="Calibri" w:eastAsia="Times New Roman" w:hAnsi="Calibri" w:cs="Arial"/>
-          <w:lang w:eastAsia="es-ES"/>
-        </w:rPr>
-        <w:t>2. Capítulo 2</w:t>
+        <w:ind w:left="720"/>
+        <w:rPr>
+          <w:rFonts w:ascii="Calibri" w:eastAsia="Times New Roman" w:hAnsi="Calibri" w:cs="Arial"/>
+          <w:lang w:eastAsia="es-ES"/>
+        </w:rPr>
+      </w:pPr>
+      <w:r>
+        <w:rPr>
+          <w:rFonts w:ascii="Calibri" w:eastAsia="Times New Roman" w:hAnsi="Calibri" w:cs="Arial"/>
+          <w:lang w:eastAsia="es-ES"/>
+        </w:rPr>
+        <w:t>1.3</w:t>
+      </w:r>
+      <w:r>
+        <w:rPr>
+          <w:rFonts w:ascii="Calibri" w:eastAsia="Times New Roman" w:hAnsi="Calibri" w:cs="Arial"/>
+          <w:lang w:eastAsia="es-ES"/>
+        </w:rPr>
+        <w:t xml:space="preserve">. </w:t>
+      </w:r>
+      <w:r>
+        <w:rPr>
+          <w:rFonts w:ascii="Calibri" w:eastAsia="Times New Roman" w:hAnsi="Calibri" w:cs="Arial"/>
+          <w:lang w:eastAsia="es-ES"/>
+        </w:rPr>
+        <w:t>Ingeniería y comportamientos de enjambres</w:t>
+      </w:r>
+      <w:r>
+        <w:rPr>
+          <w:rFonts w:ascii="Calibri" w:eastAsia="Times New Roman" w:hAnsi="Calibri" w:cs="Arial"/>
+          <w:lang w:eastAsia="es-ES"/>
+        </w:rPr>
+        <w:tab/>
+        <w:t>nº</w:t>
+      </w:r>
+    </w:p>
+    <w:p>
+      <w:pPr>
+        <w:tabs>
+          <w:tab w:val="left" w:leader="dot" w:pos="7080"/>
+        </w:tabs>
+        <w:spacing w:after="0" w:line="300" w:lineRule="exact"/>
+        <w:ind w:left="1416"/>
+        <w:rPr>
+          <w:rFonts w:ascii="Calibri" w:eastAsia="Times New Roman" w:hAnsi="Calibri" w:cs="Arial"/>
+          <w:lang w:eastAsia="es-ES"/>
+        </w:rPr>
+      </w:pPr>
+      <w:r>
+        <w:rPr>
+          <w:rFonts w:ascii="Calibri" w:eastAsia="Times New Roman" w:hAnsi="Calibri" w:cs="Arial"/>
+          <w:lang w:eastAsia="es-ES"/>
+        </w:rPr>
+        <w:t>1.3.1.</w:t>
+      </w:r>
+      <w:r>
+        <w:rPr>
+          <w:rFonts w:ascii="Calibri" w:eastAsia="Times New Roman" w:hAnsi="Calibri" w:cs="Arial"/>
+          <w:lang w:eastAsia="es-ES"/>
+        </w:rPr>
+        <w:t xml:space="preserve"> </w:t>
+      </w:r>
+      <w:r>
+        <w:rPr>
+          <w:rFonts w:ascii="Calibri" w:eastAsia="Times New Roman" w:hAnsi="Calibri" w:cs="Arial"/>
+          <w:lang w:eastAsia="es-ES"/>
+        </w:rPr>
+        <w:t>Leyes de Reynolds y algoritmo Boids</w:t>
+      </w:r>
+      <w:r>
+        <w:rPr>
+          <w:rFonts w:ascii="Calibri" w:eastAsia="Times New Roman" w:hAnsi="Calibri" w:cs="Arial"/>
+          <w:lang w:eastAsia="es-ES"/>
+        </w:rPr>
+        <w:tab/>
+      </w:r>
+    </w:p>
+    <w:p>
+      <w:pPr>
+        <w:tabs>
+          <w:tab w:val="left" w:leader="dot" w:pos="7080"/>
+        </w:tabs>
+        <w:spacing w:after="0" w:line="300" w:lineRule="exact"/>
+        <w:ind w:left="720"/>
+        <w:rPr>
+          <w:rFonts w:ascii="Calibri" w:eastAsia="Times New Roman" w:hAnsi="Calibri" w:cs="Arial"/>
+          <w:lang w:eastAsia="es-ES"/>
+        </w:rPr>
+      </w:pPr>
+      <w:r>
+        <w:rPr>
+          <w:rFonts w:ascii="Calibri" w:eastAsia="Times New Roman" w:hAnsi="Calibri" w:cs="Arial"/>
+          <w:lang w:eastAsia="es-ES"/>
+        </w:rPr>
+        <w:t>1.4</w:t>
+      </w:r>
+      <w:r>
+        <w:rPr>
+          <w:rFonts w:ascii="Calibri" w:eastAsia="Times New Roman" w:hAnsi="Calibri" w:cs="Arial"/>
+          <w:lang w:eastAsia="es-ES"/>
+        </w:rPr>
+        <w:t xml:space="preserve">. </w:t>
+      </w:r>
+      <w:r>
+        <w:rPr>
+          <w:rFonts w:ascii="Calibri" w:eastAsia="Times New Roman" w:hAnsi="Calibri" w:cs="Arial"/>
+          <w:lang w:eastAsia="es-ES"/>
+        </w:rPr>
+        <w:t>Control cooperativo de sistemas multiagente</w:t>
+      </w:r>
+      <w:r>
+        <w:rPr>
+          <w:rFonts w:ascii="Calibri" w:eastAsia="Times New Roman" w:hAnsi="Calibri" w:cs="Arial"/>
+          <w:lang w:eastAsia="es-ES"/>
+        </w:rPr>
+        <w:tab/>
+        <w:t>nº</w:t>
+      </w:r>
+    </w:p>
+    <w:p>
+      <w:pPr>
+        <w:tabs>
+          <w:tab w:val="left" w:leader="dot" w:pos="7080"/>
+        </w:tabs>
+        <w:spacing w:after="0" w:line="300" w:lineRule="exact"/>
+        <w:ind w:left="1416"/>
+        <w:rPr>
+          <w:rFonts w:ascii="Calibri" w:eastAsia="Times New Roman" w:hAnsi="Calibri" w:cs="Arial"/>
+          <w:lang w:eastAsia="es-ES"/>
+        </w:rPr>
+      </w:pPr>
+      <w:r>
+        <w:rPr>
+          <w:rFonts w:ascii="Calibri" w:eastAsia="Times New Roman" w:hAnsi="Calibri" w:cs="Arial"/>
+          <w:lang w:eastAsia="es-ES"/>
+        </w:rPr>
+        <w:t>1.4</w:t>
+      </w:r>
+      <w:r>
+        <w:rPr>
+          <w:rFonts w:ascii="Calibri" w:eastAsia="Times New Roman" w:hAnsi="Calibri" w:cs="Arial"/>
+          <w:lang w:eastAsia="es-ES"/>
+        </w:rPr>
+        <w:t xml:space="preserve">.1. </w:t>
+      </w:r>
+      <w:r>
+        <w:rPr>
+          <w:rFonts w:ascii="Calibri" w:eastAsia="Times New Roman" w:hAnsi="Calibri" w:cs="Arial"/>
+          <w:lang w:eastAsia="es-ES"/>
+        </w:rPr>
+        <w:t>Control cooperativo líder-seguidor y consenso</w:t>
+      </w:r>
+      <w:r>
+        <w:rPr>
+          <w:rFonts w:ascii="Calibri" w:eastAsia="Times New Roman" w:hAnsi="Calibri" w:cs="Arial"/>
+          <w:lang w:eastAsia="es-ES"/>
+        </w:rPr>
+        <w:tab/>
+      </w:r>
+    </w:p>
+    <w:p>
+      <w:pPr>
+        <w:tabs>
+          <w:tab w:val="left" w:leader="dot" w:pos="7080"/>
+        </w:tabs>
+        <w:spacing w:after="0" w:line="300" w:lineRule="exact"/>
+        <w:ind w:left="720"/>
+        <w:rPr>
+          <w:rFonts w:ascii="Calibri" w:eastAsia="Times New Roman" w:hAnsi="Calibri" w:cs="Arial"/>
+          <w:lang w:eastAsia="es-ES"/>
+        </w:rPr>
+      </w:pPr>
+      <w:r>
+        <w:rPr>
+          <w:rFonts w:ascii="Calibri" w:eastAsia="Times New Roman" w:hAnsi="Calibri" w:cs="Arial"/>
+          <w:lang w:eastAsia="es-ES"/>
+        </w:rPr>
+        <w:t>1.5</w:t>
+      </w:r>
+      <w:r>
+        <w:rPr>
+          <w:rFonts w:ascii="Calibri" w:eastAsia="Times New Roman" w:hAnsi="Calibri" w:cs="Arial"/>
+          <w:lang w:eastAsia="es-ES"/>
+        </w:rPr>
+        <w:t xml:space="preserve">. </w:t>
+      </w:r>
+      <w:r>
+        <w:rPr>
+          <w:rFonts w:ascii="Calibri" w:eastAsia="Times New Roman" w:hAnsi="Calibri" w:cs="Arial"/>
+          <w:lang w:eastAsia="es-ES"/>
+        </w:rPr>
+        <w:t>Síntesis: el enjambre cooperativo como capa cinética</w:t>
+      </w:r>
+      <w:r>
+        <w:rPr>
+          <w:rFonts w:ascii="Calibri" w:eastAsia="Times New Roman" w:hAnsi="Calibri" w:cs="Arial"/>
+          <w:lang w:eastAsia="es-ES"/>
+        </w:rPr>
+        <w:tab/>
+        <w:t>nº</w:t>
+      </w:r>
+    </w:p>
+    <w:p>
+      <w:pPr>
+        <w:tabs>
+          <w:tab w:val="left" w:leader="dot" w:pos="7080"/>
+        </w:tabs>
+        <w:spacing w:after="0" w:line="300" w:lineRule="exact"/>
+        <w:ind w:left="1440"/>
+        <w:rPr>
+          <w:rFonts w:ascii="Calibri" w:eastAsia="Times New Roman" w:hAnsi="Calibri" w:cs="Arial"/>
+          <w:lang w:eastAsia="es-ES"/>
+        </w:rPr>
+      </w:pPr>
+    </w:p>
+    <w:p>
+      <w:pPr>
+        <w:tabs>
+          <w:tab w:val="left" w:leader="dot" w:pos="7080"/>
+        </w:tabs>
+        <w:spacing w:after="0" w:line="300" w:lineRule="exact"/>
+        <w:rPr>
+          <w:rFonts w:ascii="Calibri" w:eastAsia="Times New Roman" w:hAnsi="Calibri" w:cs="Arial"/>
+          <w:lang w:eastAsia="es-ES"/>
+        </w:rPr>
+      </w:pPr>
+      <w:r>
+        <w:rPr>
+          <w:rFonts w:ascii="Calibri" w:eastAsia="Times New Roman" w:hAnsi="Calibri" w:cs="Arial"/>
+          <w:lang w:eastAsia="es-ES"/>
+        </w:rPr>
+        <w:t xml:space="preserve">2. </w:t>
+      </w:r>
+      <w:r>
+        <w:rPr>
+          <w:rFonts w:ascii="Calibri" w:eastAsia="Times New Roman" w:hAnsi="Calibri" w:cs="Arial"/>
+          <w:lang w:eastAsia="es-ES"/>
+        </w:rPr>
+        <w:t>MODELADO Y CONTROL COOPERATIVO LÍDER-SEGUIDOR</w:t>
       </w:r>
       <w:r>
         <w:rPr>
@@ -1541,7 +1925,14 @@
           <w:rFonts w:ascii="Calibri" w:eastAsia="Times New Roman" w:hAnsi="Calibri" w:cs="Arial"/>
           <w:lang w:eastAsia="es-ES"/>
         </w:rPr>
-        <w:t>2.1. Sección 1</w:t>
+        <w:t xml:space="preserve">2.1. </w:t>
+      </w:r>
+      <w:r>
+        <w:rPr>
+          <w:rFonts w:ascii="Calibri" w:eastAsia="Times New Roman" w:hAnsi="Calibri" w:cs="Arial"/>
+          <w:lang w:eastAsia="es-ES"/>
+        </w:rPr>
+        <w:t>Planteamiento del problema de control</w:t>
       </w:r>
       <w:r>
         <w:rPr>
@@ -1569,7 +1960,14 @@
           <w:rFonts w:ascii="Calibri" w:eastAsia="Times New Roman" w:hAnsi="Calibri" w:cs="Arial"/>
           <w:lang w:eastAsia="es-ES"/>
         </w:rPr>
-        <w:t>2.2. Sección 2</w:t>
+        <w:t xml:space="preserve">2.2. </w:t>
+      </w:r>
+      <w:r>
+        <w:rPr>
+          <w:rFonts w:ascii="Calibri" w:eastAsia="Times New Roman" w:hAnsi="Calibri" w:cs="Arial"/>
+          <w:lang w:eastAsia="es-ES"/>
+        </w:rPr>
+        <w:t>Escenario y supuestos de modelado</w:t>
       </w:r>
       <w:r>
         <w:rPr>
@@ -1577,6 +1975,82 @@
           <w:lang w:eastAsia="es-ES"/>
         </w:rPr>
         <w:tab/>
+        <w:t>nº</w:t>
+      </w:r>
+    </w:p>
+    <w:p>
+      <w:pPr>
+        <w:tabs>
+          <w:tab w:val="left" w:leader="dot" w:pos="7088"/>
+        </w:tabs>
+        <w:spacing w:after="0" w:line="300" w:lineRule="exact"/>
+        <w:ind w:left="720"/>
+        <w:rPr>
+          <w:rFonts w:ascii="Calibri" w:eastAsia="Times New Roman" w:hAnsi="Calibri" w:cs="Arial"/>
+          <w:lang w:eastAsia="es-ES"/>
+        </w:rPr>
+      </w:pPr>
+      <w:r>
+        <w:rPr>
+          <w:rFonts w:ascii="Calibri" w:eastAsia="Times New Roman" w:hAnsi="Calibri" w:cs="Arial"/>
+          <w:lang w:eastAsia="es-ES"/>
+        </w:rPr>
+        <w:t xml:space="preserve">2.1. </w:t>
+      </w:r>
+      <w:r>
+        <w:rPr>
+          <w:rFonts w:ascii="Calibri" w:eastAsia="Times New Roman" w:hAnsi="Calibri" w:cs="Arial"/>
+          <w:lang w:eastAsia="es-ES"/>
+        </w:rPr>
+        <w:t>Modelo del dron hostil</w:t>
+      </w:r>
+      <w:r>
+        <w:rPr>
+          <w:rFonts w:ascii="Calibri" w:eastAsia="Times New Roman" w:hAnsi="Calibri" w:cs="Arial"/>
+          <w:lang w:eastAsia="es-ES"/>
+        </w:rPr>
+        <w:tab/>
+        <w:t>nº</w:t>
+      </w:r>
+    </w:p>
+    <w:p>
+      <w:pPr>
+        <w:tabs>
+          <w:tab w:val="left" w:leader="dot" w:pos="7088"/>
+        </w:tabs>
+        <w:spacing w:after="0" w:line="300" w:lineRule="exact"/>
+        <w:ind w:left="720"/>
+        <w:rPr>
+          <w:rFonts w:ascii="Calibri" w:eastAsia="Times New Roman" w:hAnsi="Calibri" w:cs="Arial"/>
+          <w:lang w:eastAsia="es-ES"/>
+        </w:rPr>
+      </w:pPr>
+      <w:r>
+        <w:rPr>
+          <w:rFonts w:ascii="Calibri" w:eastAsia="Times New Roman" w:hAnsi="Calibri" w:cs="Arial"/>
+          <w:lang w:eastAsia="es-ES"/>
+        </w:rPr>
+        <w:t xml:space="preserve">2.2. </w:t>
+      </w:r>
+      <w:r>
+        <w:rPr>
+          <w:rFonts w:ascii="Calibri" w:eastAsia="Times New Roman" w:hAnsi="Calibri" w:cs="Arial"/>
+          <w:lang w:eastAsia="es-ES"/>
+        </w:rPr>
+        <w:t>Modelo del enjambre defensor</w:t>
+      </w:r>
+      <w:r>
+        <w:rPr>
+          <w:rFonts w:ascii="Calibri" w:eastAsia="Times New Roman" w:hAnsi="Calibri" w:cs="Arial"/>
+          <w:lang w:eastAsia="es-ES"/>
+        </w:rPr>
+        <w:tab/>
+      </w:r>
+      <w:r>
+        <w:rPr>
+          <w:rFonts w:ascii="Calibri" w:eastAsia="Times New Roman" w:hAnsi="Calibri" w:cs="Arial"/>
+          <w:lang w:eastAsia="es-ES"/>
+        </w:rPr>
         <w:t>nº</w:t>
       </w:r>
     </w:p>
@@ -1592,21 +2066,6 @@
           <w:lang w:eastAsia="es-ES"/>
         </w:rPr>
       </w:pPr>
-      <w:r>
-        <w:rPr>
-          <w:rFonts w:ascii="Calibri" w:eastAsia="Times New Roman" w:hAnsi="Calibri" w:cs="Arial"/>
-          <w:lang w:eastAsia="es-ES"/>
-        </w:rPr>
-        <w:t>2.2.1. Subsección 1</w:t>
-      </w:r>
-      <w:r>
-        <w:rPr>
-          <w:rFonts w:ascii="Calibri" w:eastAsia="Times New Roman" w:hAnsi="Calibri" w:cs="Arial"/>
-          <w:lang w:eastAsia="es-ES"/>
-        </w:rPr>
-        <w:tab/>
-        <w:t>nº</w:t>
-      </w:r>
     </w:p>
     <w:p>
       <w:pPr>
@@ -1614,45 +2073,24 @@
           <w:tab w:val="left" w:leader="dot" w:pos="7088"/>
         </w:tabs>
         <w:spacing w:after="0" w:line="300" w:lineRule="exact"/>
-        <w:ind w:left="1440"/>
-        <w:rPr>
-          <w:rFonts w:ascii="Calibri" w:eastAsia="Times New Roman" w:hAnsi="Calibri" w:cs="Arial"/>
-          <w:lang w:eastAsia="es-ES"/>
-        </w:rPr>
-      </w:pPr>
-      <w:r>
-        <w:rPr>
-          <w:rFonts w:ascii="Calibri" w:eastAsia="Times New Roman" w:hAnsi="Calibri" w:cs="Arial"/>
-          <w:lang w:eastAsia="es-ES"/>
-        </w:rPr>
-        <w:t>2.2.2. Subsección 2</w:t>
-      </w:r>
-      <w:r>
-        <w:rPr>
-          <w:rFonts w:ascii="Calibri" w:eastAsia="Times New Roman" w:hAnsi="Calibri" w:cs="Arial"/>
-          <w:lang w:eastAsia="es-ES"/>
-        </w:rPr>
-        <w:tab/>
-        <w:t>nº</w:t>
-      </w:r>
-    </w:p>
-    <w:p>
-      <w:pPr>
-        <w:tabs>
-          <w:tab w:val="left" w:leader="dot" w:pos="7088"/>
-        </w:tabs>
-        <w:spacing w:after="0" w:line="300" w:lineRule="exact"/>
-        <w:rPr>
-          <w:rFonts w:ascii="Calibri" w:eastAsia="Times New Roman" w:hAnsi="Calibri" w:cs="Arial"/>
-          <w:lang w:eastAsia="es-ES"/>
-        </w:rPr>
-      </w:pPr>
-      <w:r>
-        <w:rPr>
-          <w:rFonts w:ascii="Calibri" w:eastAsia="Times New Roman" w:hAnsi="Calibri" w:cs="Arial"/>
-          <w:lang w:eastAsia="es-ES"/>
-        </w:rPr>
-        <w:t>3. Capítulo 3</w:t>
+        <w:rPr>
+          <w:rFonts w:ascii="Calibri" w:eastAsia="Times New Roman" w:hAnsi="Calibri" w:cs="Arial"/>
+          <w:lang w:eastAsia="es-ES"/>
+        </w:rPr>
+      </w:pPr>
+      <w:r>
+        <w:rPr>
+          <w:rFonts w:ascii="Calibri" w:eastAsia="Times New Roman" w:hAnsi="Calibri" w:cs="Arial"/>
+          <w:lang w:eastAsia="es-ES"/>
+        </w:rPr>
+        <w:t xml:space="preserve">3. </w:t>
+      </w:r>
+      <w:r>
+        <w:rPr>
+          <w:rFonts w:ascii="Calibri" w:eastAsia="Times New Roman" w:hAnsi="Calibri" w:cs="Arial"/>
+          <w:lang w:eastAsia="es-ES"/>
+        </w:rPr>
+        <w:t>ARQUITECTURA DE INTEGRACIÓN Y VALIDACIÓN EN SIMULACIÓN</w:t>
       </w:r>
       <w:r>
         <w:rPr>
@@ -1680,7 +2118,14 @@
           <w:rFonts w:ascii="Calibri" w:eastAsia="Times New Roman" w:hAnsi="Calibri" w:cs="Arial"/>
           <w:lang w:eastAsia="es-ES"/>
         </w:rPr>
-        <w:t>3.1. Sección 1</w:t>
+        <w:t xml:space="preserve">3.1. </w:t>
+      </w:r>
+      <w:r>
+        <w:rPr>
+          <w:rFonts w:ascii="Calibri" w:eastAsia="Times New Roman" w:hAnsi="Calibri" w:cs="Arial"/>
+          <w:lang w:eastAsia="es-ES"/>
+        </w:rPr>
+        <w:t>Arquitectura general de la co-simulación</w:t>
       </w:r>
       <w:r>
         <w:rPr>
@@ -1708,90 +2153,14 @@
           <w:rFonts w:ascii="Calibri" w:eastAsia="Times New Roman" w:hAnsi="Calibri" w:cs="Arial"/>
           <w:lang w:eastAsia="es-ES"/>
         </w:rPr>
-        <w:t>3.2. Sección 2</w:t>
-      </w:r>
-      <w:r>
-        <w:rPr>
-          <w:rFonts w:ascii="Calibri" w:eastAsia="Times New Roman" w:hAnsi="Calibri" w:cs="Arial"/>
-          <w:lang w:eastAsia="es-ES"/>
-        </w:rPr>
-        <w:tab/>
-        <w:t>nº</w:t>
-      </w:r>
-    </w:p>
-    <w:p>
-      <w:pPr>
-        <w:tabs>
-          <w:tab w:val="left" w:leader="dot" w:pos="7088"/>
-        </w:tabs>
-        <w:spacing w:after="0" w:line="300" w:lineRule="exact"/>
-        <w:ind w:left="1440"/>
-        <w:rPr>
-          <w:rFonts w:ascii="Calibri" w:eastAsia="Times New Roman" w:hAnsi="Calibri" w:cs="Arial"/>
-          <w:lang w:eastAsia="es-ES"/>
-        </w:rPr>
-      </w:pPr>
-      <w:r>
-        <w:rPr>
-          <w:rFonts w:ascii="Calibri" w:eastAsia="Times New Roman" w:hAnsi="Calibri" w:cs="Arial"/>
-          <w:lang w:eastAsia="es-ES"/>
-        </w:rPr>
-        <w:t>3.2.1. Subsección 1</w:t>
-      </w:r>
-      <w:r>
-        <w:rPr>
-          <w:rFonts w:ascii="Calibri" w:eastAsia="Times New Roman" w:hAnsi="Calibri" w:cs="Arial"/>
-          <w:lang w:eastAsia="es-ES"/>
-        </w:rPr>
-        <w:tab/>
-        <w:t>nº</w:t>
-      </w:r>
-    </w:p>
-    <w:p>
-      <w:pPr>
-        <w:tabs>
-          <w:tab w:val="left" w:leader="dot" w:pos="7088"/>
-        </w:tabs>
-        <w:spacing w:after="0" w:line="300" w:lineRule="exact"/>
-        <w:ind w:left="1440"/>
-        <w:rPr>
-          <w:rFonts w:ascii="Calibri" w:eastAsia="Times New Roman" w:hAnsi="Calibri" w:cs="Arial"/>
-          <w:lang w:eastAsia="es-ES"/>
-        </w:rPr>
-      </w:pPr>
-      <w:r>
-        <w:rPr>
-          <w:rFonts w:ascii="Calibri" w:eastAsia="Times New Roman" w:hAnsi="Calibri" w:cs="Arial"/>
-          <w:lang w:eastAsia="es-ES"/>
-        </w:rPr>
-        <w:t>3.2.2. Subsección 2</w:t>
-      </w:r>
-      <w:r>
-        <w:rPr>
-          <w:rFonts w:ascii="Calibri" w:eastAsia="Times New Roman" w:hAnsi="Calibri" w:cs="Arial"/>
-          <w:lang w:eastAsia="es-ES"/>
-        </w:rPr>
-        <w:tab/>
-        <w:t>nº</w:t>
-      </w:r>
-    </w:p>
-    <w:p>
-      <w:pPr>
-        <w:tabs>
-          <w:tab w:val="left" w:leader="dot" w:pos="7088"/>
-        </w:tabs>
-        <w:spacing w:after="0" w:line="300" w:lineRule="exact"/>
-        <w:rPr>
-          <w:rFonts w:ascii="Calibri" w:eastAsia="Times New Roman" w:hAnsi="Calibri" w:cs="Arial"/>
-          <w:lang w:eastAsia="es-ES"/>
-        </w:rPr>
-      </w:pPr>
-      <w:r>
-        <w:rPr>
-          <w:rFonts w:ascii="Calibri" w:eastAsia="Times New Roman" w:hAnsi="Calibri" w:cs="Arial"/>
-          <w:lang w:eastAsia="es-ES"/>
-        </w:rPr>
-        <w:t>4. Capítulo 4</w:t>
+        <w:t xml:space="preserve">3.2. </w:t>
+      </w:r>
+      <w:r>
+        <w:rPr>
+          <w:rFonts w:ascii="Calibri" w:eastAsia="Times New Roman" w:hAnsi="Calibri" w:cs="Arial"/>
+          <w:lang w:eastAsia="es-ES"/>
+        </w:rPr>
+        <w:t>Comunicación entre MATLAB y CoppeliaSim</w:t>
       </w:r>
       <w:r>
         <w:rPr>
@@ -1819,7 +2188,21 @@
           <w:rFonts w:ascii="Calibri" w:eastAsia="Times New Roman" w:hAnsi="Calibri" w:cs="Arial"/>
           <w:lang w:eastAsia="es-ES"/>
         </w:rPr>
-        <w:t>4.1. Sección 1</w:t>
+        <w:t>3.3</w:t>
+      </w:r>
+      <w:r>
+        <w:rPr>
+          <w:rFonts w:ascii="Calibri" w:eastAsia="Times New Roman" w:hAnsi="Calibri" w:cs="Arial"/>
+          <w:lang w:eastAsia="es-ES"/>
+        </w:rPr>
+        <w:t xml:space="preserve">. </w:t>
+      </w:r>
+      <w:r>
+        <w:rPr>
+          <w:rFonts w:ascii="Calibri" w:eastAsia="Times New Roman" w:hAnsi="Calibri" w:cs="Arial"/>
+          <w:lang w:eastAsia="es-ES"/>
+        </w:rPr>
+        <w:t>Construcción de la escena</w:t>
       </w:r>
       <w:r>
         <w:rPr>
@@ -1847,7 +2230,21 @@
           <w:rFonts w:ascii="Calibri" w:eastAsia="Times New Roman" w:hAnsi="Calibri" w:cs="Arial"/>
           <w:lang w:eastAsia="es-ES"/>
         </w:rPr>
-        <w:t>4.2. Sección 2</w:t>
+        <w:t>3.4</w:t>
+      </w:r>
+      <w:r>
+        <w:rPr>
+          <w:rFonts w:ascii="Calibri" w:eastAsia="Times New Roman" w:hAnsi="Calibri" w:cs="Arial"/>
+          <w:lang w:eastAsia="es-ES"/>
+        </w:rPr>
+        <w:t xml:space="preserve">. </w:t>
+      </w:r>
+      <w:r>
+        <w:rPr>
+          <w:rFonts w:ascii="Calibri" w:eastAsia="Times New Roman" w:hAnsi="Calibri" w:cs="Arial"/>
+          <w:lang w:eastAsia="es-ES"/>
+        </w:rPr>
+        <w:t>Ciclo de ejecución</w:t>
       </w:r>
       <w:r>
         <w:rPr>
@@ -1864,18 +2261,32 @@
           <w:tab w:val="left" w:leader="dot" w:pos="7088"/>
         </w:tabs>
         <w:spacing w:after="0" w:line="300" w:lineRule="exact"/>
-        <w:ind w:left="1440"/>
-        <w:rPr>
-          <w:rFonts w:ascii="Calibri" w:eastAsia="Times New Roman" w:hAnsi="Calibri" w:cs="Arial"/>
-          <w:lang w:eastAsia="es-ES"/>
-        </w:rPr>
-      </w:pPr>
-      <w:r>
-        <w:rPr>
-          <w:rFonts w:ascii="Calibri" w:eastAsia="Times New Roman" w:hAnsi="Calibri" w:cs="Arial"/>
-          <w:lang w:eastAsia="es-ES"/>
-        </w:rPr>
-        <w:t>4.2.1. Subsección 1</w:t>
+        <w:ind w:left="720"/>
+        <w:rPr>
+          <w:rFonts w:ascii="Calibri" w:eastAsia="Times New Roman" w:hAnsi="Calibri" w:cs="Arial"/>
+          <w:lang w:eastAsia="es-ES"/>
+        </w:rPr>
+      </w:pPr>
+      <w:r>
+        <w:rPr>
+          <w:rFonts w:ascii="Calibri" w:eastAsia="Times New Roman" w:hAnsi="Calibri" w:cs="Arial"/>
+          <w:lang w:eastAsia="es-ES"/>
+        </w:rPr>
+        <w:t>3.5</w:t>
+      </w:r>
+      <w:r>
+        <w:rPr>
+          <w:rFonts w:ascii="Calibri" w:eastAsia="Times New Roman" w:hAnsi="Calibri" w:cs="Arial"/>
+          <w:lang w:eastAsia="es-ES"/>
+        </w:rPr>
+        <w:t xml:space="preserve">. </w:t>
+      </w:r>
+      <w:r>
+        <w:rPr>
+          <w:rFonts w:ascii="Calibri" w:eastAsia="Times New Roman" w:hAnsi="Calibri" w:cs="Arial"/>
+          <w:lang w:eastAsia="es-ES"/>
+        </w:rPr>
+        <w:t>Validación del comportamiento cinemático</w:t>
       </w:r>
       <w:r>
         <w:rPr>
@@ -1892,27 +2303,11 @@
           <w:tab w:val="left" w:leader="dot" w:pos="7088"/>
         </w:tabs>
         <w:spacing w:after="0" w:line="300" w:lineRule="exact"/>
-        <w:ind w:left="1440"/>
-        <w:rPr>
-          <w:rFonts w:ascii="Calibri" w:eastAsia="Times New Roman" w:hAnsi="Calibri" w:cs="Arial"/>
-          <w:lang w:eastAsia="es-ES"/>
-        </w:rPr>
-      </w:pPr>
-      <w:r>
-        <w:rPr>
-          <w:rFonts w:ascii="Calibri" w:eastAsia="Times New Roman" w:hAnsi="Calibri" w:cs="Arial"/>
-          <w:lang w:eastAsia="es-ES"/>
-        </w:rPr>
-        <w:t>4.2.2. Subsección 2</w:t>
-      </w:r>
-      <w:r>
-        <w:rPr>
-          <w:rFonts w:ascii="Calibri" w:eastAsia="Times New Roman" w:hAnsi="Calibri" w:cs="Arial"/>
-          <w:lang w:eastAsia="es-ES"/>
-        </w:rPr>
-        <w:tab/>
-        <w:t>nº</w:t>
-      </w:r>
+        <w:rPr>
+          <w:rFonts w:ascii="Calibri" w:eastAsia="Times New Roman" w:hAnsi="Calibri" w:cs="Arial"/>
+          <w:lang w:eastAsia="es-ES"/>
+        </w:rPr>
+      </w:pPr>
     </w:p>
     <w:p>
       <w:pPr>
@@ -1925,6 +2320,28 @@
           <w:lang w:eastAsia="es-ES"/>
         </w:rPr>
       </w:pPr>
+      <w:r>
+        <w:rPr>
+          <w:rFonts w:ascii="Calibri" w:eastAsia="Times New Roman" w:hAnsi="Calibri" w:cs="Arial"/>
+          <w:lang w:eastAsia="es-ES"/>
+        </w:rPr>
+        <w:t xml:space="preserve">4. </w:t>
+      </w:r>
+      <w:r>
+        <w:rPr>
+          <w:rFonts w:ascii="Calibri" w:eastAsia="Times New Roman" w:hAnsi="Calibri" w:cs="Arial"/>
+          <w:lang w:eastAsia="es-ES"/>
+        </w:rPr>
+        <w:t>EVALUACIÓN DE DESEMPEÑO Y ANÁLISIS DE RESULTADOS</w:t>
+      </w:r>
+      <w:r>
+        <w:rPr>
+          <w:rFonts w:ascii="Calibri" w:eastAsia="Times New Roman" w:hAnsi="Calibri" w:cs="Arial"/>
+          <w:lang w:eastAsia="es-ES"/>
+        </w:rPr>
+        <w:tab/>
+        <w:t>nº</w:t>
+      </w:r>
     </w:p>
     <w:p>
       <w:pPr>
@@ -1932,17 +2349,25 @@
           <w:tab w:val="left" w:leader="dot" w:pos="7088"/>
         </w:tabs>
         <w:spacing w:after="0" w:line="300" w:lineRule="exact"/>
-        <w:rPr>
-          <w:rFonts w:ascii="Calibri" w:eastAsia="Times New Roman" w:hAnsi="Calibri" w:cs="Arial"/>
-          <w:lang w:eastAsia="es-ES"/>
-        </w:rPr>
-      </w:pPr>
-      <w:r>
-        <w:rPr>
-          <w:rFonts w:ascii="Calibri" w:eastAsia="Times New Roman" w:hAnsi="Calibri" w:cs="Arial"/>
-          <w:lang w:eastAsia="es-ES"/>
-        </w:rPr>
-        <w:t>Conclusiones</w:t>
+        <w:ind w:left="720"/>
+        <w:rPr>
+          <w:rFonts w:ascii="Calibri" w:eastAsia="Times New Roman" w:hAnsi="Calibri" w:cs="Arial"/>
+          <w:lang w:eastAsia="es-ES"/>
+        </w:rPr>
+      </w:pPr>
+      <w:r>
+        <w:rPr>
+          <w:rFonts w:ascii="Calibri" w:eastAsia="Times New Roman" w:hAnsi="Calibri" w:cs="Arial"/>
+          <w:lang w:eastAsia="es-ES"/>
+        </w:rPr>
+        <w:t xml:space="preserve">4.1. </w:t>
+      </w:r>
+      <w:r>
+        <w:rPr>
+          <w:rFonts w:ascii="Calibri" w:eastAsia="Times New Roman" w:hAnsi="Calibri" w:cs="Arial"/>
+          <w:lang w:eastAsia="es-ES"/>
+        </w:rPr>
+        <w:t>Indicadores de desempeño</w:t>
       </w:r>
       <w:r>
         <w:rPr>
@@ -1959,17 +2384,25 @@
           <w:tab w:val="left" w:leader="dot" w:pos="7088"/>
         </w:tabs>
         <w:spacing w:after="0" w:line="300" w:lineRule="exact"/>
-        <w:rPr>
-          <w:rFonts w:ascii="Calibri" w:eastAsia="Times New Roman" w:hAnsi="Calibri" w:cs="Arial"/>
-          <w:lang w:eastAsia="es-ES"/>
-        </w:rPr>
-      </w:pPr>
-      <w:r>
-        <w:rPr>
-          <w:rFonts w:ascii="Calibri" w:eastAsia="Times New Roman" w:hAnsi="Calibri" w:cs="Arial"/>
-          <w:lang w:eastAsia="es-ES"/>
-        </w:rPr>
-        <w:t>Posibles mejoras futuras del proyecto</w:t>
+        <w:ind w:left="720"/>
+        <w:rPr>
+          <w:rFonts w:ascii="Calibri" w:eastAsia="Times New Roman" w:hAnsi="Calibri" w:cs="Arial"/>
+          <w:lang w:eastAsia="es-ES"/>
+        </w:rPr>
+      </w:pPr>
+      <w:r>
+        <w:rPr>
+          <w:rFonts w:ascii="Calibri" w:eastAsia="Times New Roman" w:hAnsi="Calibri" w:cs="Arial"/>
+          <w:lang w:eastAsia="es-ES"/>
+        </w:rPr>
+        <w:t xml:space="preserve">4.2. </w:t>
+      </w:r>
+      <w:r>
+        <w:rPr>
+          <w:rFonts w:ascii="Calibri" w:eastAsia="Times New Roman" w:hAnsi="Calibri" w:cs="Arial"/>
+          <w:lang w:eastAsia="es-ES"/>
+        </w:rPr>
+        <w:t>Procedimiento de evaluación</w:t>
       </w:r>
       <w:r>
         <w:rPr>
@@ -1986,17 +2419,32 @@
           <w:tab w:val="left" w:leader="dot" w:pos="7088"/>
         </w:tabs>
         <w:spacing w:after="0" w:line="300" w:lineRule="exact"/>
-        <w:rPr>
-          <w:rFonts w:ascii="Calibri" w:eastAsia="Times New Roman" w:hAnsi="Calibri" w:cs="Arial"/>
-          <w:lang w:eastAsia="es-ES"/>
-        </w:rPr>
-      </w:pPr>
-      <w:r>
-        <w:rPr>
-          <w:rFonts w:ascii="Calibri" w:eastAsia="Times New Roman" w:hAnsi="Calibri" w:cs="Arial"/>
-          <w:lang w:eastAsia="es-ES"/>
-        </w:rPr>
-        <w:t>Bibliografía</w:t>
+        <w:ind w:left="720"/>
+        <w:rPr>
+          <w:rFonts w:ascii="Calibri" w:eastAsia="Times New Roman" w:hAnsi="Calibri" w:cs="Arial"/>
+          <w:lang w:eastAsia="es-ES"/>
+        </w:rPr>
+      </w:pPr>
+      <w:r>
+        <w:rPr>
+          <w:rFonts w:ascii="Calibri" w:eastAsia="Times New Roman" w:hAnsi="Calibri" w:cs="Arial"/>
+          <w:lang w:eastAsia="es-ES"/>
+        </w:rPr>
+        <w:t>4.3</w:t>
+      </w:r>
+      <w:r>
+        <w:rPr>
+          <w:rFonts w:ascii="Calibri" w:eastAsia="Times New Roman" w:hAnsi="Calibri" w:cs="Arial"/>
+          <w:lang w:eastAsia="es-ES"/>
+        </w:rPr>
+        <w:t xml:space="preserve">. </w:t>
+      </w:r>
+      <w:r>
+        <w:rPr>
+          <w:rFonts w:ascii="Calibri" w:eastAsia="Times New Roman" w:hAnsi="Calibri" w:cs="Arial"/>
+          <w:lang w:eastAsia="es-ES"/>
+        </w:rPr>
+        <w:t>Resultados</w:t>
       </w:r>
       <w:r>
         <w:rPr>
@@ -2013,17 +2461,46 @@
           <w:tab w:val="left" w:leader="dot" w:pos="7088"/>
         </w:tabs>
         <w:spacing w:after="0" w:line="300" w:lineRule="exact"/>
-        <w:rPr>
-          <w:rFonts w:ascii="Calibri" w:eastAsia="Times New Roman" w:hAnsi="Calibri" w:cs="Arial"/>
-          <w:lang w:eastAsia="es-ES"/>
-        </w:rPr>
-      </w:pPr>
-      <w:r>
-        <w:rPr>
-          <w:rFonts w:ascii="Calibri" w:eastAsia="Times New Roman" w:hAnsi="Calibri" w:cs="Arial"/>
-          <w:lang w:eastAsia="es-ES"/>
-        </w:rPr>
-        <w:t>Índice de figuras (opcional)</w:t>
+        <w:ind w:left="1416"/>
+        <w:rPr>
+          <w:rFonts w:ascii="Calibri" w:eastAsia="Times New Roman" w:hAnsi="Calibri" w:cs="Arial"/>
+          <w:lang w:eastAsia="es-ES"/>
+        </w:rPr>
+      </w:pPr>
+      <w:r>
+        <w:rPr>
+          <w:rFonts w:ascii="Calibri" w:eastAsia="Times New Roman" w:hAnsi="Calibri" w:cs="Arial"/>
+          <w:lang w:eastAsia="es-ES"/>
+        </w:rPr>
+        <w:t>4.3</w:t>
+      </w:r>
+      <w:r>
+        <w:rPr>
+          <w:rFonts w:ascii="Calibri" w:eastAsia="Times New Roman" w:hAnsi="Calibri" w:cs="Arial"/>
+          <w:lang w:eastAsia="es-ES"/>
+        </w:rPr>
+        <w:t>.</w:t>
+      </w:r>
+      <w:r>
+        <w:rPr>
+          <w:rFonts w:ascii="Calibri" w:eastAsia="Times New Roman" w:hAnsi="Calibri" w:cs="Arial"/>
+          <w:lang w:eastAsia="es-ES"/>
+        </w:rPr>
+        <w:t>1.</w:t>
+      </w:r>
+      <w:r>
+        <w:rPr>
+          <w:rFonts w:ascii="Calibri" w:eastAsia="Times New Roman" w:hAnsi="Calibri" w:cs="Arial"/>
+          <w:lang w:eastAsia="es-ES"/>
+        </w:rPr>
+        <w:t xml:space="preserve"> </w:t>
+      </w:r>
+      <w:r>
+        <w:rPr>
+          <w:rFonts w:ascii="Calibri" w:eastAsia="Times New Roman" w:hAnsi="Calibri" w:cs="Arial"/>
+          <w:lang w:eastAsia="es-ES"/>
+        </w:rPr>
+        <w:t>Efectividad de la defensa</w:t>
       </w:r>
       <w:r>
         <w:rPr>
@@ -2040,17 +2517,46 @@
           <w:tab w:val="left" w:leader="dot" w:pos="7088"/>
         </w:tabs>
         <w:spacing w:after="0" w:line="300" w:lineRule="exact"/>
-        <w:rPr>
-          <w:rFonts w:ascii="Calibri" w:eastAsia="Times New Roman" w:hAnsi="Calibri" w:cs="Arial"/>
-          <w:lang w:eastAsia="es-ES"/>
-        </w:rPr>
-      </w:pPr>
-      <w:r>
-        <w:rPr>
-          <w:rFonts w:ascii="Calibri" w:eastAsia="Times New Roman" w:hAnsi="Calibri" w:cs="Arial"/>
-          <w:lang w:eastAsia="es-ES"/>
-        </w:rPr>
-        <w:t>Índice de tablas (opcional)</w:t>
+        <w:ind w:left="1416"/>
+        <w:rPr>
+          <w:rFonts w:ascii="Calibri" w:eastAsia="Times New Roman" w:hAnsi="Calibri" w:cs="Arial"/>
+          <w:lang w:eastAsia="es-ES"/>
+        </w:rPr>
+      </w:pPr>
+      <w:r>
+        <w:rPr>
+          <w:rFonts w:ascii="Calibri" w:eastAsia="Times New Roman" w:hAnsi="Calibri" w:cs="Arial"/>
+          <w:lang w:eastAsia="es-ES"/>
+        </w:rPr>
+        <w:t>4.3</w:t>
+      </w:r>
+      <w:r>
+        <w:rPr>
+          <w:rFonts w:ascii="Calibri" w:eastAsia="Times New Roman" w:hAnsi="Calibri" w:cs="Arial"/>
+          <w:lang w:eastAsia="es-ES"/>
+        </w:rPr>
+        <w:t>.</w:t>
+      </w:r>
+      <w:r>
+        <w:rPr>
+          <w:rFonts w:ascii="Calibri" w:eastAsia="Times New Roman" w:hAnsi="Calibri" w:cs="Arial"/>
+          <w:lang w:eastAsia="es-ES"/>
+        </w:rPr>
+        <w:t>2.</w:t>
+      </w:r>
+      <w:r>
+        <w:rPr>
+          <w:rFonts w:ascii="Calibri" w:eastAsia="Times New Roman" w:hAnsi="Calibri" w:cs="Arial"/>
+          <w:lang w:eastAsia="es-ES"/>
+        </w:rPr>
+        <w:t xml:space="preserve"> </w:t>
+      </w:r>
+      <w:r>
+        <w:rPr>
+          <w:rFonts w:ascii="Calibri" w:eastAsia="Times New Roman" w:hAnsi="Calibri" w:cs="Arial"/>
+          <w:lang w:eastAsia="es-ES"/>
+        </w:rPr>
+        <w:t>Tiempo de respuesta</w:t>
       </w:r>
       <w:r>
         <w:rPr>
@@ -2067,17 +2573,46 @@
           <w:tab w:val="left" w:leader="dot" w:pos="7088"/>
         </w:tabs>
         <w:spacing w:after="0" w:line="300" w:lineRule="exact"/>
-        <w:rPr>
-          <w:rFonts w:ascii="Calibri" w:eastAsia="Times New Roman" w:hAnsi="Calibri" w:cs="Arial"/>
-          <w:lang w:eastAsia="es-ES"/>
-        </w:rPr>
-      </w:pPr>
-      <w:r>
-        <w:rPr>
-          <w:rFonts w:ascii="Calibri" w:eastAsia="Times New Roman" w:hAnsi="Calibri" w:cs="Arial"/>
-          <w:lang w:eastAsia="es-ES"/>
-        </w:rPr>
-        <w:t>Anexo (opcional)</w:t>
+        <w:ind w:left="1416"/>
+        <w:rPr>
+          <w:rFonts w:ascii="Calibri" w:eastAsia="Times New Roman" w:hAnsi="Calibri" w:cs="Arial"/>
+          <w:lang w:eastAsia="es-ES"/>
+        </w:rPr>
+      </w:pPr>
+      <w:r>
+        <w:rPr>
+          <w:rFonts w:ascii="Calibri" w:eastAsia="Times New Roman" w:hAnsi="Calibri" w:cs="Arial"/>
+          <w:lang w:eastAsia="es-ES"/>
+        </w:rPr>
+        <w:t>4.3</w:t>
+      </w:r>
+      <w:r>
+        <w:rPr>
+          <w:rFonts w:ascii="Calibri" w:eastAsia="Times New Roman" w:hAnsi="Calibri" w:cs="Arial"/>
+          <w:lang w:eastAsia="es-ES"/>
+        </w:rPr>
+        <w:t>.</w:t>
+      </w:r>
+      <w:r>
+        <w:rPr>
+          <w:rFonts w:ascii="Calibri" w:eastAsia="Times New Roman" w:hAnsi="Calibri" w:cs="Arial"/>
+          <w:lang w:eastAsia="es-ES"/>
+        </w:rPr>
+        <w:t>3.</w:t>
+      </w:r>
+      <w:r>
+        <w:rPr>
+          <w:rFonts w:ascii="Calibri" w:eastAsia="Times New Roman" w:hAnsi="Calibri" w:cs="Arial"/>
+          <w:lang w:eastAsia="es-ES"/>
+        </w:rPr>
+        <w:t xml:space="preserve"> </w:t>
+      </w:r>
+      <w:r>
+        <w:rPr>
+          <w:rFonts w:ascii="Calibri" w:eastAsia="Times New Roman" w:hAnsi="Calibri" w:cs="Arial"/>
+          <w:lang w:eastAsia="es-ES"/>
+        </w:rPr>
+        <w:t>Seguridad entre agentes propios</w:t>
       </w:r>
       <w:r>
         <w:rPr>
@@ -2090,660 +2625,416 @@
     </w:p>
     <w:p>
       <w:pPr>
+        <w:tabs>
+          <w:tab w:val="left" w:leader="dot" w:pos="7088"/>
+        </w:tabs>
         <w:spacing w:after="0" w:line="300" w:lineRule="exact"/>
-        <w:rPr>
-          <w:rFonts w:ascii="Calibri" w:eastAsia="Times New Roman" w:hAnsi="Calibri" w:cs="Arial"/>
-          <w:lang w:eastAsia="es-ES"/>
-        </w:rPr>
-      </w:pPr>
-    </w:p>
-    <w:p>
-      <w:pPr>
+        <w:ind w:left="1416"/>
+        <w:rPr>
+          <w:rFonts w:ascii="Calibri" w:eastAsia="Times New Roman" w:hAnsi="Calibri" w:cs="Arial"/>
+          <w:lang w:eastAsia="es-ES"/>
+        </w:rPr>
+      </w:pPr>
+      <w:r>
+        <w:rPr>
+          <w:rFonts w:ascii="Calibri" w:eastAsia="Times New Roman" w:hAnsi="Calibri" w:cs="Arial"/>
+          <w:lang w:eastAsia="es-ES"/>
+        </w:rPr>
+        <w:t>4.3.</w:t>
+      </w:r>
+      <w:r>
+        <w:rPr>
+          <w:rFonts w:ascii="Calibri" w:eastAsia="Times New Roman" w:hAnsi="Calibri" w:cs="Arial"/>
+          <w:lang w:eastAsia="es-ES"/>
+        </w:rPr>
+        <w:t>4</w:t>
+      </w:r>
+      <w:r>
+        <w:rPr>
+          <w:rFonts w:ascii="Calibri" w:eastAsia="Times New Roman" w:hAnsi="Calibri" w:cs="Arial"/>
+          <w:lang w:eastAsia="es-ES"/>
+        </w:rPr>
+        <w:t xml:space="preserve">. </w:t>
+      </w:r>
+      <w:r>
+        <w:rPr>
+          <w:rFonts w:ascii="Calibri" w:eastAsia="Times New Roman" w:hAnsi="Calibri" w:cs="Arial"/>
+          <w:lang w:eastAsia="es-ES"/>
+        </w:rPr>
+        <w:t>Análisis de sensibilidad al radio de contacto</w:t>
+      </w:r>
+      <w:r>
+        <w:rPr>
+          <w:rFonts w:ascii="Calibri" w:eastAsia="Times New Roman" w:hAnsi="Calibri" w:cs="Arial"/>
+          <w:lang w:eastAsia="es-ES"/>
+        </w:rPr>
+        <w:tab/>
+        <w:t>nº</w:t>
+      </w:r>
+    </w:p>
+    <w:p>
+      <w:pPr>
+        <w:tabs>
+          <w:tab w:val="left" w:leader="dot" w:pos="7088"/>
+        </w:tabs>
         <w:spacing w:after="0" w:line="300" w:lineRule="exact"/>
-        <w:rPr>
-          <w:rFonts w:ascii="Calibri" w:eastAsia="Times New Roman" w:hAnsi="Calibri" w:cs="Arial"/>
-          <w:lang w:eastAsia="es-ES"/>
-        </w:rPr>
-      </w:pPr>
+        <w:ind w:left="720"/>
+        <w:rPr>
+          <w:rFonts w:ascii="Calibri" w:eastAsia="Times New Roman" w:hAnsi="Calibri" w:cs="Arial"/>
+          <w:lang w:eastAsia="es-ES"/>
+        </w:rPr>
+      </w:pPr>
+      <w:r>
+        <w:rPr>
+          <w:rFonts w:ascii="Calibri" w:eastAsia="Times New Roman" w:hAnsi="Calibri" w:cs="Arial"/>
+          <w:lang w:eastAsia="es-ES"/>
+        </w:rPr>
+        <w:t xml:space="preserve">4.2. </w:t>
+      </w:r>
+      <w:r>
+        <w:rPr>
+          <w:rFonts w:ascii="Calibri" w:eastAsia="Times New Roman" w:hAnsi="Calibri" w:cs="Arial"/>
+          <w:lang w:eastAsia="es-ES"/>
+        </w:rPr>
+        <w:t>Discusión</w:t>
+      </w:r>
       <w:r>
         <w:rPr>
           <w:rFonts w:ascii="Calibri" w:eastAsia="Times New Roman" w:hAnsi="Calibri" w:cs="Arial"/>
           <w:lang w:eastAsia="es-ES"/>
         </w:rPr>
         <w:tab/>
-      </w:r>
-    </w:p>
-    <w:p>
-      <w:pPr>
+        <w:t>nº</w:t>
+      </w:r>
+    </w:p>
+    <w:p>
+      <w:pPr>
+        <w:tabs>
+          <w:tab w:val="left" w:leader="dot" w:pos="7088"/>
+        </w:tabs>
         <w:spacing w:after="0" w:line="300" w:lineRule="exact"/>
-        <w:rPr>
-          <w:rFonts w:ascii="Calibri" w:eastAsia="Times New Roman" w:hAnsi="Calibri" w:cs="Arial"/>
-          <w:lang w:eastAsia="es-ES"/>
-        </w:rPr>
-      </w:pPr>
-    </w:p>
-    <w:p>
-      <w:pPr>
+        <w:ind w:left="720"/>
+        <w:rPr>
+          <w:rFonts w:ascii="Calibri" w:eastAsia="Times New Roman" w:hAnsi="Calibri" w:cs="Arial"/>
+          <w:lang w:eastAsia="es-ES"/>
+        </w:rPr>
+      </w:pPr>
+      <w:r>
+        <w:rPr>
+          <w:rFonts w:ascii="Calibri" w:eastAsia="Times New Roman" w:hAnsi="Calibri" w:cs="Arial"/>
+          <w:lang w:eastAsia="es-ES"/>
+        </w:rPr>
+        <w:t xml:space="preserve">4.2. </w:t>
+      </w:r>
+      <w:r>
+        <w:rPr>
+          <w:rFonts w:ascii="Calibri" w:eastAsia="Times New Roman" w:hAnsi="Calibri" w:cs="Arial"/>
+          <w:lang w:eastAsia="es-ES"/>
+        </w:rPr>
+        <w:t>Limitaciones</w:t>
+      </w:r>
+      <w:r>
+        <w:rPr>
+          <w:rFonts w:ascii="Calibri" w:eastAsia="Times New Roman" w:hAnsi="Calibri" w:cs="Arial"/>
+          <w:lang w:eastAsia="es-ES"/>
+        </w:rPr>
+        <w:tab/>
+        <w:t>nº</w:t>
+      </w:r>
+    </w:p>
+    <w:p>
+      <w:pPr>
+        <w:tabs>
+          <w:tab w:val="left" w:leader="dot" w:pos="7088"/>
+        </w:tabs>
         <w:spacing w:after="0" w:line="300" w:lineRule="exact"/>
-        <w:rPr>
-          <w:rFonts w:ascii="Calibri" w:eastAsia="Times New Roman" w:hAnsi="Calibri" w:cs="Arial"/>
-          <w:lang w:eastAsia="es-ES"/>
-        </w:rPr>
-      </w:pPr>
-    </w:p>
-    <w:p>
-      <w:pPr>
+        <w:ind w:left="1416"/>
+        <w:rPr>
+          <w:rFonts w:ascii="Calibri" w:eastAsia="Times New Roman" w:hAnsi="Calibri" w:cs="Arial"/>
+          <w:lang w:eastAsia="es-ES"/>
+        </w:rPr>
+      </w:pPr>
+    </w:p>
+    <w:p>
+      <w:pPr>
+        <w:tabs>
+          <w:tab w:val="left" w:leader="dot" w:pos="7088"/>
+        </w:tabs>
         <w:spacing w:after="0" w:line="300" w:lineRule="exact"/>
-        <w:rPr>
-          <w:rFonts w:ascii="Calibri" w:eastAsia="Times New Roman" w:hAnsi="Calibri" w:cs="Arial"/>
-          <w:lang w:eastAsia="es-ES"/>
-        </w:rPr>
-      </w:pPr>
-    </w:p>
-    <w:p>
-      <w:pPr>
+        <w:ind w:left="720"/>
+        <w:rPr>
+          <w:rFonts w:ascii="Calibri" w:eastAsia="Times New Roman" w:hAnsi="Calibri" w:cs="Arial"/>
+          <w:lang w:eastAsia="es-ES"/>
+        </w:rPr>
+      </w:pPr>
+    </w:p>
+    <w:p>
+      <w:pPr>
+        <w:tabs>
+          <w:tab w:val="left" w:leader="dot" w:pos="7088"/>
+        </w:tabs>
         <w:spacing w:after="0" w:line="300" w:lineRule="exact"/>
         <w:rPr>
           <w:rFonts w:ascii="Calibri" w:eastAsia="Times New Roman" w:hAnsi="Calibri" w:cs="Arial"/>
           <w:lang w:eastAsia="es-ES"/>
         </w:rPr>
       </w:pPr>
-    </w:p>
-    <w:p>
-      <w:pPr>
+      <w:r>
+        <w:rPr>
+          <w:rFonts w:ascii="Calibri" w:eastAsia="Times New Roman" w:hAnsi="Calibri" w:cs="Arial"/>
+          <w:lang w:eastAsia="es-ES"/>
+        </w:rPr>
+        <w:t>Conclusiones</w:t>
+      </w:r>
+      <w:r>
+        <w:rPr>
+          <w:rFonts w:ascii="Calibri" w:eastAsia="Times New Roman" w:hAnsi="Calibri" w:cs="Arial"/>
+          <w:lang w:eastAsia="es-ES"/>
+        </w:rPr>
+        <w:tab/>
+        <w:t>nº</w:t>
+      </w:r>
+    </w:p>
+    <w:p>
+      <w:pPr>
+        <w:tabs>
+          <w:tab w:val="left" w:leader="dot" w:pos="7088"/>
+        </w:tabs>
         <w:spacing w:after="0" w:line="300" w:lineRule="exact"/>
         <w:rPr>
           <w:rFonts w:ascii="Calibri" w:eastAsia="Times New Roman" w:hAnsi="Calibri" w:cs="Arial"/>
           <w:lang w:eastAsia="es-ES"/>
         </w:rPr>
       </w:pPr>
-    </w:p>
-    <w:p>
-      <w:pPr>
+      <w:r>
+        <w:rPr>
+          <w:rFonts w:ascii="Calibri" w:eastAsia="Times New Roman" w:hAnsi="Calibri" w:cs="Arial"/>
+          <w:lang w:eastAsia="es-ES"/>
+        </w:rPr>
+        <w:t>Posibles mejoras futuras del proyecto</w:t>
+      </w:r>
+      <w:r>
+        <w:rPr>
+          <w:rFonts w:ascii="Calibri" w:eastAsia="Times New Roman" w:hAnsi="Calibri" w:cs="Arial"/>
+          <w:lang w:eastAsia="es-ES"/>
+        </w:rPr>
+        <w:tab/>
+        <w:t>nº</w:t>
+      </w:r>
+    </w:p>
+    <w:p>
+      <w:pPr>
+        <w:tabs>
+          <w:tab w:val="left" w:leader="dot" w:pos="7088"/>
+        </w:tabs>
         <w:spacing w:after="0" w:line="300" w:lineRule="exact"/>
         <w:rPr>
           <w:rFonts w:ascii="Calibri" w:eastAsia="Times New Roman" w:hAnsi="Calibri" w:cs="Arial"/>
           <w:lang w:eastAsia="es-ES"/>
         </w:rPr>
       </w:pPr>
-    </w:p>
-    <w:p>
-      <w:pPr>
+      <w:r>
+        <w:rPr>
+          <w:rFonts w:ascii="Calibri" w:eastAsia="Times New Roman" w:hAnsi="Calibri" w:cs="Arial"/>
+          <w:lang w:eastAsia="es-ES"/>
+        </w:rPr>
+        <w:t>Bibliografía</w:t>
+      </w:r>
+      <w:r>
+        <w:rPr>
+          <w:rFonts w:ascii="Calibri" w:eastAsia="Times New Roman" w:hAnsi="Calibri" w:cs="Arial"/>
+          <w:lang w:eastAsia="es-ES"/>
+        </w:rPr>
+        <w:tab/>
+        <w:t>nº</w:t>
+      </w:r>
+    </w:p>
+    <w:p>
+      <w:pPr>
+        <w:tabs>
+          <w:tab w:val="left" w:leader="dot" w:pos="7088"/>
+        </w:tabs>
         <w:spacing w:after="0" w:line="300" w:lineRule="exact"/>
         <w:rPr>
           <w:rFonts w:ascii="Calibri" w:eastAsia="Times New Roman" w:hAnsi="Calibri" w:cs="Arial"/>
           <w:lang w:eastAsia="es-ES"/>
         </w:rPr>
       </w:pPr>
-    </w:p>
-    <w:p>
-      <w:pPr>
+      <w:r>
+        <w:rPr>
+          <w:rFonts w:ascii="Calibri" w:eastAsia="Times New Roman" w:hAnsi="Calibri" w:cs="Arial"/>
+          <w:lang w:eastAsia="es-ES"/>
+        </w:rPr>
+        <w:t>Índice de figuras (opcional)</w:t>
+      </w:r>
+      <w:r>
+        <w:rPr>
+          <w:rFonts w:ascii="Calibri" w:eastAsia="Times New Roman" w:hAnsi="Calibri" w:cs="Arial"/>
+          <w:lang w:eastAsia="es-ES"/>
+        </w:rPr>
+        <w:tab/>
+        <w:t>nº</w:t>
+      </w:r>
+    </w:p>
+    <w:p>
+      <w:pPr>
+        <w:tabs>
+          <w:tab w:val="left" w:leader="dot" w:pos="7088"/>
+        </w:tabs>
         <w:spacing w:after="0" w:line="300" w:lineRule="exact"/>
         <w:rPr>
           <w:rFonts w:ascii="Calibri" w:eastAsia="Times New Roman" w:hAnsi="Calibri" w:cs="Arial"/>
           <w:lang w:eastAsia="es-ES"/>
         </w:rPr>
       </w:pPr>
-    </w:p>
-    <w:p>
-      <w:pPr>
+      <w:r>
+        <w:rPr>
+          <w:rFonts w:ascii="Calibri" w:eastAsia="Times New Roman" w:hAnsi="Calibri" w:cs="Arial"/>
+          <w:lang w:eastAsia="es-ES"/>
+        </w:rPr>
+        <w:t>Índice de tablas (opcional)</w:t>
+      </w:r>
+      <w:r>
+        <w:rPr>
+          <w:rFonts w:ascii="Calibri" w:eastAsia="Times New Roman" w:hAnsi="Calibri" w:cs="Arial"/>
+          <w:lang w:eastAsia="es-ES"/>
+        </w:rPr>
+        <w:tab/>
+        <w:t>nº</w:t>
+      </w:r>
+    </w:p>
+    <w:p>
+      <w:pPr>
+        <w:tabs>
+          <w:tab w:val="left" w:leader="dot" w:pos="7088"/>
+        </w:tabs>
         <w:spacing w:after="0" w:line="300" w:lineRule="exact"/>
         <w:rPr>
           <w:rFonts w:ascii="Calibri" w:eastAsia="Times New Roman" w:hAnsi="Calibri" w:cs="Arial"/>
           <w:lang w:eastAsia="es-ES"/>
         </w:rPr>
       </w:pPr>
-    </w:p>
-    <w:p>
-      <w:pPr>
-        <w:spacing w:before="100" w:beforeAutospacing="1" w:after="100" w:afterAutospacing="1" w:line="240" w:lineRule="auto"/>
-        <w:rPr>
-          <w:rFonts w:ascii="Times New Roman" w:eastAsia="Times New Roman" w:hAnsi="Times New Roman" w:cs="Times New Roman"/>
-          <w:sz w:val="24"/>
-          <w:szCs w:val="24"/>
-          <w:lang w:val="es-CO" w:eastAsia="es-CO"/>
-        </w:rPr>
-      </w:pPr>
-      <w:r>
-        <w:rPr>
-          <w:rFonts w:ascii="Times New Roman" w:eastAsia="Times New Roman" w:hAnsi="Times New Roman" w:cs="Times New Roman"/>
-          <w:b/>
-          <w:bCs/>
-          <w:sz w:val="24"/>
-          <w:szCs w:val="24"/>
-          <w:lang w:val="es-CO" w:eastAsia="es-CO"/>
-        </w:rPr>
-        <w:t>ÍNDICE</w:t>
-      </w:r>
-    </w:p>
-    <w:p>
-      <w:pPr>
-        <w:spacing w:before="100" w:beforeAutospacing="1" w:after="100" w:afterAutospacing="1" w:line="240" w:lineRule="auto"/>
-        <w:rPr>
-          <w:rFonts w:ascii="Times New Roman" w:eastAsia="Times New Roman" w:hAnsi="Times New Roman" w:cs="Times New Roman"/>
-          <w:sz w:val="24"/>
-          <w:szCs w:val="24"/>
-          <w:lang w:val="es-CO" w:eastAsia="es-CO"/>
-        </w:rPr>
-      </w:pPr>
-      <w:r>
-        <w:rPr>
-          <w:rFonts w:ascii="Times New Roman" w:eastAsia="Times New Roman" w:hAnsi="Times New Roman" w:cs="Times New Roman"/>
-          <w:sz w:val="24"/>
-          <w:szCs w:val="24"/>
-          <w:lang w:val="es-CO" w:eastAsia="es-CO"/>
-        </w:rPr>
-        <w:t>Resumen y palabras clave</w:t>
-      </w:r>
-      <w:r>
-        <w:rPr>
-          <w:rFonts w:ascii="Times New Roman" w:eastAsia="Times New Roman" w:hAnsi="Times New Roman" w:cs="Times New Roman"/>
-          <w:sz w:val="24"/>
-          <w:szCs w:val="24"/>
-          <w:lang w:val="es-CO" w:eastAsia="es-CO"/>
-        </w:rPr>
-        <w:br/>
-        <w:t>Introducción</w:t>
-      </w:r>
-      <w:r>
-        <w:rPr>
-          <w:rFonts w:ascii="Times New Roman" w:eastAsia="Times New Roman" w:hAnsi="Times New Roman" w:cs="Times New Roman"/>
-          <w:sz w:val="24"/>
-          <w:szCs w:val="24"/>
-          <w:lang w:val="es-CO" w:eastAsia="es-CO"/>
-        </w:rPr>
-        <w:br/>
-        <w:t>Objetivos</w:t>
-      </w:r>
-      <w:r>
-        <w:rPr>
-          <w:rFonts w:ascii="Times New Roman" w:eastAsia="Times New Roman" w:hAnsi="Times New Roman" w:cs="Times New Roman"/>
-          <w:sz w:val="24"/>
-          <w:szCs w:val="24"/>
-          <w:lang w:val="es-CO" w:eastAsia="es-CO"/>
-        </w:rPr>
-        <w:br/>
-        <w:t>Metodología</w:t>
-      </w:r>
-    </w:p>
-    <w:p>
-      <w:pPr>
-        <w:spacing w:before="100" w:beforeAutospacing="1" w:after="100" w:afterAutospacing="1" w:line="240" w:lineRule="auto"/>
-        <w:rPr>
-          <w:rFonts w:ascii="Times New Roman" w:eastAsia="Times New Roman" w:hAnsi="Times New Roman" w:cs="Times New Roman"/>
-          <w:sz w:val="24"/>
-          <w:szCs w:val="24"/>
-          <w:lang w:val="es-CO" w:eastAsia="es-CO"/>
-        </w:rPr>
-      </w:pPr>
-      <w:r>
-        <w:rPr>
-          <w:rFonts w:ascii="Times New Roman" w:eastAsia="Times New Roman" w:hAnsi="Times New Roman" w:cs="Times New Roman"/>
-          <w:b/>
-          <w:bCs/>
-          <w:sz w:val="24"/>
-          <w:szCs w:val="24"/>
-          <w:lang w:val="es-CO" w:eastAsia="es-CO"/>
-        </w:rPr>
-        <w:t>1. MARCO TEÓRICO Y ESTADO DEL ARTE</w:t>
-      </w:r>
-      <w:r>
-        <w:rPr>
-          <w:rFonts w:ascii="Times New Roman" w:eastAsia="Times New Roman" w:hAnsi="Times New Roman" w:cs="Times New Roman"/>
-          <w:sz w:val="24"/>
-          <w:szCs w:val="24"/>
-          <w:lang w:val="es-CO" w:eastAsia="es-CO"/>
-        </w:rPr>
-        <w:br/>
-        <w:t>1.1. La amenaza UAS de baja altitud</w:t>
-      </w:r>
-      <w:r>
-        <w:rPr>
-          <w:rFonts w:ascii="Times New Roman" w:eastAsia="Times New Roman" w:hAnsi="Times New Roman" w:cs="Times New Roman"/>
-          <w:sz w:val="24"/>
-          <w:szCs w:val="24"/>
-          <w:lang w:val="es-CO" w:eastAsia="es-CO"/>
-        </w:rPr>
-        <w:br/>
-        <w:t>1.1.1. Clasificación de los sistemas aéreos no tripulados</w:t>
-      </w:r>
-      <w:r>
-        <w:rPr>
-          <w:rFonts w:ascii="Times New Roman" w:eastAsia="Times New Roman" w:hAnsi="Times New Roman" w:cs="Times New Roman"/>
-          <w:sz w:val="24"/>
-          <w:szCs w:val="24"/>
-          <w:lang w:val="es-CO" w:eastAsia="es-CO"/>
-        </w:rPr>
-        <w:br/>
-        <w:t>1.1.2. Tipología de la amenaza</w:t>
-      </w:r>
-      <w:r>
-        <w:rPr>
-          <w:rFonts w:ascii="Times New Roman" w:eastAsia="Times New Roman" w:hAnsi="Times New Roman" w:cs="Times New Roman"/>
-          <w:sz w:val="24"/>
-          <w:szCs w:val="24"/>
-          <w:lang w:val="es-CO" w:eastAsia="es-CO"/>
-        </w:rPr>
-        <w:br/>
-        <w:t>1.1.3. El caso colombiano</w:t>
-      </w:r>
-      <w:r>
-        <w:rPr>
-          <w:rFonts w:ascii="Times New Roman" w:eastAsia="Times New Roman" w:hAnsi="Times New Roman" w:cs="Times New Roman"/>
-          <w:sz w:val="24"/>
-          <w:szCs w:val="24"/>
-          <w:lang w:val="es-CO" w:eastAsia="es-CO"/>
-        </w:rPr>
-        <w:br/>
-        <w:t>1.2. Sistemas C-UAS: taxonomía y defensa por capas</w:t>
-      </w:r>
-      <w:r>
-        <w:rPr>
-          <w:rFonts w:ascii="Times New Roman" w:eastAsia="Times New Roman" w:hAnsi="Times New Roman" w:cs="Times New Roman"/>
-          <w:sz w:val="24"/>
-          <w:szCs w:val="24"/>
-          <w:lang w:val="es-CO" w:eastAsia="es-CO"/>
-        </w:rPr>
-        <w:br/>
-        <w:t>1.2.1. Sistemas de detección en C-UAS</w:t>
-      </w:r>
-      <w:r>
-        <w:rPr>
-          <w:rFonts w:ascii="Times New Roman" w:eastAsia="Times New Roman" w:hAnsi="Times New Roman" w:cs="Times New Roman"/>
-          <w:sz w:val="24"/>
-          <w:szCs w:val="24"/>
-          <w:lang w:val="es-CO" w:eastAsia="es-CO"/>
-        </w:rPr>
-        <w:br/>
-        <w:t>1.2.2. Sistemas de inhibición y neutralización</w:t>
-      </w:r>
-      <w:r>
-        <w:rPr>
-          <w:rFonts w:ascii="Times New Roman" w:eastAsia="Times New Roman" w:hAnsi="Times New Roman" w:cs="Times New Roman"/>
-          <w:sz w:val="24"/>
-          <w:szCs w:val="24"/>
-          <w:lang w:val="es-CO" w:eastAsia="es-CO"/>
-        </w:rPr>
-        <w:br/>
-        <w:t>1.3. Ingeniería y comportamientos de enjambres</w:t>
-      </w:r>
-      <w:r>
-        <w:rPr>
-          <w:rFonts w:ascii="Times New Roman" w:eastAsia="Times New Roman" w:hAnsi="Times New Roman" w:cs="Times New Roman"/>
-          <w:sz w:val="24"/>
-          <w:szCs w:val="24"/>
-          <w:lang w:val="es-CO" w:eastAsia="es-CO"/>
-        </w:rPr>
-        <w:br/>
-        <w:t>1.3.1. Leyes de Reynolds y algoritmo Boids</w:t>
-      </w:r>
-      <w:r>
-        <w:rPr>
-          <w:rFonts w:ascii="Times New Roman" w:eastAsia="Times New Roman" w:hAnsi="Times New Roman" w:cs="Times New Roman"/>
-          <w:sz w:val="24"/>
-          <w:szCs w:val="24"/>
-          <w:lang w:val="es-CO" w:eastAsia="es-CO"/>
-        </w:rPr>
-        <w:br/>
-        <w:t>1.4. Control cooperativo de sistemas multiagente</w:t>
-      </w:r>
-      <w:r>
-        <w:rPr>
-          <w:rFonts w:ascii="Times New Roman" w:eastAsia="Times New Roman" w:hAnsi="Times New Roman" w:cs="Times New Roman"/>
-          <w:sz w:val="24"/>
-          <w:szCs w:val="24"/>
-          <w:lang w:val="es-CO" w:eastAsia="es-CO"/>
-        </w:rPr>
-        <w:br/>
-        <w:t>1.4.1. Control cooperativo líder-seguidor y consenso</w:t>
-      </w:r>
-      <w:r>
-        <w:rPr>
-          <w:rFonts w:ascii="Times New Roman" w:eastAsia="Times New Roman" w:hAnsi="Times New Roman" w:cs="Times New Roman"/>
-          <w:sz w:val="24"/>
-          <w:szCs w:val="24"/>
-          <w:lang w:val="es-CO" w:eastAsia="es-CO"/>
-        </w:rPr>
-        <w:br/>
-        <w:t>1.5. Síntesis: el enjambre cooperativo como capa cinética</w:t>
-      </w:r>
-    </w:p>
-    <w:p>
-      <w:pPr>
-        <w:spacing w:before="100" w:beforeAutospacing="1" w:after="100" w:afterAutospacing="1" w:line="240" w:lineRule="auto"/>
-        <w:rPr>
-          <w:rFonts w:ascii="Times New Roman" w:eastAsia="Times New Roman" w:hAnsi="Times New Roman" w:cs="Times New Roman"/>
-          <w:sz w:val="24"/>
-          <w:szCs w:val="24"/>
-          <w:lang w:val="es-CO" w:eastAsia="es-CO"/>
-        </w:rPr>
-      </w:pPr>
-      <w:r>
-        <w:rPr>
-          <w:rFonts w:ascii="Times New Roman" w:eastAsia="Times New Roman" w:hAnsi="Times New Roman" w:cs="Times New Roman"/>
-          <w:b/>
-          <w:bCs/>
-          <w:sz w:val="24"/>
-          <w:szCs w:val="24"/>
-          <w:lang w:val="es-CO" w:eastAsia="es-CO"/>
-        </w:rPr>
-        <w:t>2. MODELADO Y CONTROL COOPERATIVO LÍDER-SEGUIDOR</w:t>
-      </w:r>
-      <w:r>
-        <w:rPr>
-          <w:rFonts w:ascii="Times New Roman" w:eastAsia="Times New Roman" w:hAnsi="Times New Roman" w:cs="Times New Roman"/>
-          <w:sz w:val="24"/>
-          <w:szCs w:val="24"/>
-          <w:lang w:val="es-CO" w:eastAsia="es-CO"/>
-        </w:rPr>
-        <w:br/>
-        <w:t>2.1. Planteamiento del problema de control</w:t>
-      </w:r>
-      <w:r>
-        <w:rPr>
-          <w:rFonts w:ascii="Times New Roman" w:eastAsia="Times New Roman" w:hAnsi="Times New Roman" w:cs="Times New Roman"/>
-          <w:sz w:val="24"/>
-          <w:szCs w:val="24"/>
-          <w:lang w:val="es-CO" w:eastAsia="es-CO"/>
-        </w:rPr>
-        <w:br/>
-        <w:t>2.2. Escenario y supuestos de modelado</w:t>
-      </w:r>
-      <w:r>
-        <w:rPr>
-          <w:rFonts w:ascii="Times New Roman" w:eastAsia="Times New Roman" w:hAnsi="Times New Roman" w:cs="Times New Roman"/>
-          <w:sz w:val="24"/>
-          <w:szCs w:val="24"/>
-          <w:lang w:val="es-CO" w:eastAsia="es-CO"/>
-        </w:rPr>
-        <w:br/>
-        <w:t>2.3. Modelo del dron hostil</w:t>
-      </w:r>
-      <w:r>
-        <w:rPr>
-          <w:rFonts w:ascii="Times New Roman" w:eastAsia="Times New Roman" w:hAnsi="Times New Roman" w:cs="Times New Roman"/>
-          <w:sz w:val="24"/>
-          <w:szCs w:val="24"/>
-          <w:lang w:val="es-CO" w:eastAsia="es-CO"/>
-        </w:rPr>
-        <w:br/>
-        <w:t>2.4. Modelo del enjambre defensor</w:t>
-      </w:r>
-      <w:r>
-        <w:rPr>
-          <w:rFonts w:ascii="Times New Roman" w:eastAsia="Times New Roman" w:hAnsi="Times New Roman" w:cs="Times New Roman"/>
-          <w:sz w:val="24"/>
-          <w:szCs w:val="24"/>
-          <w:lang w:val="es-CO" w:eastAsia="es-CO"/>
-        </w:rPr>
-        <w:br/>
-        <w:t>2.5. [Título de tu sección 2.5]</w:t>
-      </w:r>
-      <w:r>
-        <w:rPr>
-          <w:rFonts w:ascii="Times New Roman" w:eastAsia="Times New Roman" w:hAnsi="Times New Roman" w:cs="Times New Roman"/>
-          <w:sz w:val="24"/>
-          <w:szCs w:val="24"/>
-          <w:lang w:val="es-CO" w:eastAsia="es-CO"/>
-        </w:rPr>
-        <w:br/>
-        <w:t>2.6. [Título de tu sección 2.6, si la tienes]</w:t>
-      </w:r>
-    </w:p>
-    <w:p>
-      <w:pPr>
-        <w:spacing w:before="100" w:beforeAutospacing="1" w:after="100" w:afterAutospacing="1" w:line="240" w:lineRule="auto"/>
-        <w:rPr>
-          <w:rFonts w:ascii="Times New Roman" w:eastAsia="Times New Roman" w:hAnsi="Times New Roman" w:cs="Times New Roman"/>
-          <w:sz w:val="24"/>
-          <w:szCs w:val="24"/>
-          <w:lang w:val="es-CO" w:eastAsia="es-CO"/>
-        </w:rPr>
-      </w:pPr>
-      <w:r>
-        <w:rPr>
-          <w:rFonts w:ascii="Times New Roman" w:eastAsia="Times New Roman" w:hAnsi="Times New Roman" w:cs="Times New Roman"/>
-          <w:b/>
-          <w:bCs/>
-          <w:sz w:val="24"/>
-          <w:szCs w:val="24"/>
-          <w:lang w:val="es-CO" w:eastAsia="es-CO"/>
-        </w:rPr>
-        <w:t>3. ARQUITECTURA DE INTEGRACIÓN Y VALIDACIÓN EN SIMULACIÓN</w:t>
-      </w:r>
-      <w:r>
-        <w:rPr>
-          <w:rFonts w:ascii="Times New Roman" w:eastAsia="Times New Roman" w:hAnsi="Times New Roman" w:cs="Times New Roman"/>
-          <w:sz w:val="24"/>
-          <w:szCs w:val="24"/>
-          <w:lang w:val="es-CO" w:eastAsia="es-CO"/>
-        </w:rPr>
-        <w:br/>
-        <w:t>3.1. Arquitectura general de la co-simulación</w:t>
-      </w:r>
-      <w:r>
-        <w:rPr>
-          <w:rFonts w:ascii="Times New Roman" w:eastAsia="Times New Roman" w:hAnsi="Times New Roman" w:cs="Times New Roman"/>
-          <w:sz w:val="24"/>
-          <w:szCs w:val="24"/>
-          <w:lang w:val="es-CO" w:eastAsia="es-CO"/>
-        </w:rPr>
-        <w:br/>
-        <w:t>3.2. Comunicación entre MATLAB y CoppeliaSim</w:t>
-      </w:r>
-      <w:r>
-        <w:rPr>
-          <w:rFonts w:ascii="Times New Roman" w:eastAsia="Times New Roman" w:hAnsi="Times New Roman" w:cs="Times New Roman"/>
-          <w:sz w:val="24"/>
-          <w:szCs w:val="24"/>
-          <w:lang w:val="es-CO" w:eastAsia="es-CO"/>
-        </w:rPr>
-        <w:br/>
-        <w:t>3.3. Construcción de la escena</w:t>
-      </w:r>
-      <w:r>
-        <w:rPr>
-          <w:rFonts w:ascii="Times New Roman" w:eastAsia="Times New Roman" w:hAnsi="Times New Roman" w:cs="Times New Roman"/>
-          <w:sz w:val="24"/>
-          <w:szCs w:val="24"/>
-          <w:lang w:val="es-CO" w:eastAsia="es-CO"/>
-        </w:rPr>
-        <w:br/>
-        <w:t>3.4. Ciclo de ejecución</w:t>
-      </w:r>
-      <w:r>
-        <w:rPr>
-          <w:rFonts w:ascii="Times New Roman" w:eastAsia="Times New Roman" w:hAnsi="Times New Roman" w:cs="Times New Roman"/>
-          <w:sz w:val="24"/>
-          <w:szCs w:val="24"/>
-          <w:lang w:val="es-CO" w:eastAsia="es-CO"/>
-        </w:rPr>
-        <w:br/>
-        <w:t>3.5. Validación del comportamiento cinemático</w:t>
-      </w:r>
-    </w:p>
-    <w:p>
-      <w:pPr>
-        <w:spacing w:before="100" w:beforeAutospacing="1" w:after="100" w:afterAutospacing="1" w:line="240" w:lineRule="auto"/>
-        <w:rPr>
-          <w:rFonts w:ascii="Times New Roman" w:eastAsia="Times New Roman" w:hAnsi="Times New Roman" w:cs="Times New Roman"/>
-          <w:sz w:val="24"/>
-          <w:szCs w:val="24"/>
-          <w:lang w:val="es-CO" w:eastAsia="es-CO"/>
-        </w:rPr>
-      </w:pPr>
-      <w:r>
-        <w:rPr>
-          <w:rFonts w:ascii="Times New Roman" w:eastAsia="Times New Roman" w:hAnsi="Times New Roman" w:cs="Times New Roman"/>
-          <w:b/>
-          <w:bCs/>
-          <w:sz w:val="24"/>
-          <w:szCs w:val="24"/>
-          <w:lang w:val="es-CO" w:eastAsia="es-CO"/>
-        </w:rPr>
-        <w:t>4. EVALUACIÓN DE DESEMPEÑO Y ANÁLISIS DE RESULTADOS</w:t>
-      </w:r>
-      <w:r>
-        <w:rPr>
-          <w:rFonts w:ascii="Times New Roman" w:eastAsia="Times New Roman" w:hAnsi="Times New Roman" w:cs="Times New Roman"/>
-          <w:sz w:val="24"/>
-          <w:szCs w:val="24"/>
-          <w:lang w:val="es-CO" w:eastAsia="es-CO"/>
-        </w:rPr>
-        <w:br/>
-        <w:t>4.1. Indicadores de desempeño</w:t>
-      </w:r>
-      <w:r>
-        <w:rPr>
-          <w:rFonts w:ascii="Times New Roman" w:eastAsia="Times New Roman" w:hAnsi="Times New Roman" w:cs="Times New Roman"/>
-          <w:sz w:val="24"/>
-          <w:szCs w:val="24"/>
-          <w:lang w:val="es-CO" w:eastAsia="es-CO"/>
-        </w:rPr>
-        <w:br/>
-        <w:t>4.2. Procedimiento de evaluación</w:t>
-      </w:r>
-      <w:r>
-        <w:rPr>
-          <w:rFonts w:ascii="Times New Roman" w:eastAsia="Times New Roman" w:hAnsi="Times New Roman" w:cs="Times New Roman"/>
-          <w:sz w:val="24"/>
-          <w:szCs w:val="24"/>
-          <w:lang w:val="es-CO" w:eastAsia="es-CO"/>
-        </w:rPr>
-        <w:br/>
-        <w:t>4.3. Resultados</w:t>
-      </w:r>
-      <w:r>
-        <w:rPr>
-          <w:rFonts w:ascii="Times New Roman" w:eastAsia="Times New Roman" w:hAnsi="Times New Roman" w:cs="Times New Roman"/>
-          <w:sz w:val="24"/>
-          <w:szCs w:val="24"/>
-          <w:lang w:val="es-CO" w:eastAsia="es-CO"/>
-        </w:rPr>
-        <w:br/>
-        <w:t>4.3.1. Efectividad de la defensa</w:t>
-      </w:r>
-      <w:r>
-        <w:rPr>
-          <w:rFonts w:ascii="Times New Roman" w:eastAsia="Times New Roman" w:hAnsi="Times New Roman" w:cs="Times New Roman"/>
-          <w:sz w:val="24"/>
-          <w:szCs w:val="24"/>
-          <w:lang w:val="es-CO" w:eastAsia="es-CO"/>
-        </w:rPr>
-        <w:br/>
-        <w:t>4.3.2. Tiempo de respuesta</w:t>
-      </w:r>
-      <w:r>
-        <w:rPr>
-          <w:rFonts w:ascii="Times New Roman" w:eastAsia="Times New Roman" w:hAnsi="Times New Roman" w:cs="Times New Roman"/>
-          <w:sz w:val="24"/>
-          <w:szCs w:val="24"/>
-          <w:lang w:val="es-CO" w:eastAsia="es-CO"/>
-        </w:rPr>
-        <w:br/>
-        <w:t>4.3.3. Seguridad entre agentes propios</w:t>
-      </w:r>
-      <w:r>
-        <w:rPr>
-          <w:rFonts w:ascii="Times New Roman" w:eastAsia="Times New Roman" w:hAnsi="Times New Roman" w:cs="Times New Roman"/>
-          <w:sz w:val="24"/>
-          <w:szCs w:val="24"/>
-          <w:lang w:val="es-CO" w:eastAsia="es-CO"/>
-        </w:rPr>
-        <w:br/>
-        <w:t>4.3.4. Análisis de sensibilidad al radio de contacto</w:t>
-      </w:r>
-      <w:r>
-        <w:rPr>
-          <w:rFonts w:ascii="Times New Roman" w:eastAsia="Times New Roman" w:hAnsi="Times New Roman" w:cs="Times New Roman"/>
-          <w:sz w:val="24"/>
-          <w:szCs w:val="24"/>
-          <w:lang w:val="es-CO" w:eastAsia="es-CO"/>
-        </w:rPr>
-        <w:br/>
-        <w:t>4.4. Discusión</w:t>
-      </w:r>
-      <w:r>
-        <w:rPr>
-          <w:rFonts w:ascii="Times New Roman" w:eastAsia="Times New Roman" w:hAnsi="Times New Roman" w:cs="Times New Roman"/>
-          <w:sz w:val="24"/>
-          <w:szCs w:val="24"/>
-          <w:lang w:val="es-CO" w:eastAsia="es-CO"/>
-        </w:rPr>
-        <w:br/>
-        <w:t>4.5. Limitaciones</w:t>
-      </w:r>
-    </w:p>
-    <w:p>
-      <w:pPr>
-        <w:spacing w:before="100" w:beforeAutospacing="1" w:after="100" w:afterAutospacing="1" w:line="240" w:lineRule="auto"/>
-        <w:rPr>
-          <w:rFonts w:ascii="Times New Roman" w:eastAsia="Times New Roman" w:hAnsi="Times New Roman" w:cs="Times New Roman"/>
-          <w:sz w:val="24"/>
-          <w:szCs w:val="24"/>
-          <w:lang w:val="es-CO" w:eastAsia="es-CO"/>
-        </w:rPr>
-      </w:pPr>
-      <w:r>
-        <w:rPr>
-          <w:rFonts w:ascii="Times New Roman" w:eastAsia="Times New Roman" w:hAnsi="Times New Roman" w:cs="Times New Roman"/>
-          <w:sz w:val="24"/>
-          <w:szCs w:val="24"/>
-          <w:lang w:val="es-CO" w:eastAsia="es-CO"/>
-        </w:rPr>
-        <w:lastRenderedPageBreak/>
-        <w:t>Conclusiones</w:t>
-      </w:r>
-      <w:r>
-        <w:rPr>
-          <w:rFonts w:ascii="Times New Roman" w:eastAsia="Times New Roman" w:hAnsi="Times New Roman" w:cs="Times New Roman"/>
-          <w:sz w:val="24"/>
-          <w:szCs w:val="24"/>
-          <w:lang w:val="es-CO" w:eastAsia="es-CO"/>
-        </w:rPr>
-        <w:br/>
-        <w:t>Posibles mejoras futuras del proyecto</w:t>
-      </w:r>
-      <w:r>
-        <w:rPr>
-          <w:rFonts w:ascii="Times New Roman" w:eastAsia="Times New Roman" w:hAnsi="Times New Roman" w:cs="Times New Roman"/>
-          <w:sz w:val="24"/>
-          <w:szCs w:val="24"/>
-          <w:lang w:val="es-CO" w:eastAsia="es-CO"/>
-        </w:rPr>
-        <w:br/>
-        <w:t>Bibliografía</w:t>
-      </w:r>
-      <w:r>
-        <w:rPr>
-          <w:rFonts w:ascii="Times New Roman" w:eastAsia="Times New Roman" w:hAnsi="Times New Roman" w:cs="Times New Roman"/>
-          <w:sz w:val="24"/>
-          <w:szCs w:val="24"/>
-          <w:lang w:val="es-CO" w:eastAsia="es-CO"/>
-        </w:rPr>
-        <w:br/>
-        <w:t>Índice de figuras</w:t>
-      </w:r>
-      <w:r>
-        <w:rPr>
-          <w:rFonts w:ascii="Times New Roman" w:eastAsia="Times New Roman" w:hAnsi="Times New Roman" w:cs="Times New Roman"/>
-          <w:sz w:val="24"/>
-          <w:szCs w:val="24"/>
-          <w:lang w:val="es-CO" w:eastAsia="es-CO"/>
-        </w:rPr>
-        <w:br/>
-        <w:t>Índice de tablas</w:t>
-      </w:r>
-      <w:r>
-        <w:rPr>
-          <w:rFonts w:ascii="Times New Roman" w:eastAsia="Times New Roman" w:hAnsi="Times New Roman" w:cs="Times New Roman"/>
-          <w:sz w:val="24"/>
-          <w:szCs w:val="24"/>
-          <w:lang w:val="es-CO" w:eastAsia="es-CO"/>
-        </w:rPr>
-        <w:br/>
-        <w:t>Anexos</w:t>
-      </w:r>
+      <w:r>
+        <w:rPr>
+          <w:rFonts w:ascii="Calibri" w:eastAsia="Times New Roman" w:hAnsi="Calibri" w:cs="Arial"/>
+          <w:lang w:eastAsia="es-ES"/>
+        </w:rPr>
+        <w:t>Anexo (opcional)</w:t>
+      </w:r>
+      <w:r>
+        <w:rPr>
+          <w:rFonts w:ascii="Calibri" w:eastAsia="Times New Roman" w:hAnsi="Calibri" w:cs="Arial"/>
+          <w:lang w:eastAsia="es-ES"/>
+        </w:rPr>
+        <w:tab/>
+        <w:t>nº</w:t>
+      </w:r>
+    </w:p>
+    <w:p>
+      <w:pPr>
+        <w:spacing w:after="0" w:line="300" w:lineRule="exact"/>
+        <w:rPr>
+          <w:rFonts w:ascii="Calibri" w:eastAsia="Times New Roman" w:hAnsi="Calibri" w:cs="Arial"/>
+          <w:lang w:eastAsia="es-ES"/>
+        </w:rPr>
+      </w:pPr>
+    </w:p>
+    <w:p>
+      <w:pPr>
+        <w:spacing w:after="0" w:line="300" w:lineRule="exact"/>
+        <w:rPr>
+          <w:rFonts w:ascii="Calibri" w:eastAsia="Times New Roman" w:hAnsi="Calibri" w:cs="Arial"/>
+          <w:lang w:eastAsia="es-ES"/>
+        </w:rPr>
+      </w:pPr>
+      <w:r>
+        <w:rPr>
+          <w:rFonts w:ascii="Calibri" w:eastAsia="Times New Roman" w:hAnsi="Calibri" w:cs="Arial"/>
+          <w:lang w:eastAsia="es-ES"/>
+        </w:rPr>
+        <w:tab/>
+      </w:r>
+    </w:p>
+    <w:p>
+      <w:pPr>
+        <w:spacing w:after="0" w:line="300" w:lineRule="exact"/>
+        <w:rPr>
+          <w:rFonts w:ascii="Calibri" w:eastAsia="Times New Roman" w:hAnsi="Calibri" w:cs="Arial"/>
+          <w:lang w:eastAsia="es-ES"/>
+        </w:rPr>
+      </w:pPr>
+    </w:p>
+    <w:p>
+      <w:pPr>
+        <w:spacing w:after="0" w:line="300" w:lineRule="exact"/>
+        <w:rPr>
+          <w:rFonts w:ascii="Calibri" w:eastAsia="Times New Roman" w:hAnsi="Calibri" w:cs="Arial"/>
+          <w:lang w:eastAsia="es-ES"/>
+        </w:rPr>
+      </w:pPr>
+    </w:p>
+    <w:p>
+      <w:pPr>
+        <w:spacing w:after="0" w:line="300" w:lineRule="exact"/>
+        <w:rPr>
+          <w:rFonts w:ascii="Calibri" w:eastAsia="Times New Roman" w:hAnsi="Calibri" w:cs="Arial"/>
+          <w:lang w:eastAsia="es-ES"/>
+        </w:rPr>
+      </w:pPr>
+    </w:p>
+    <w:p>
+      <w:pPr>
+        <w:spacing w:after="0" w:line="300" w:lineRule="exact"/>
+        <w:rPr>
+          <w:rFonts w:ascii="Calibri" w:eastAsia="Times New Roman" w:hAnsi="Calibri" w:cs="Arial"/>
+          <w:lang w:eastAsia="es-ES"/>
+        </w:rPr>
+      </w:pPr>
+    </w:p>
+    <w:p>
+      <w:pPr>
+        <w:spacing w:after="0" w:line="300" w:lineRule="exact"/>
+        <w:rPr>
+          <w:rFonts w:ascii="Calibri" w:eastAsia="Times New Roman" w:hAnsi="Calibri" w:cs="Arial"/>
+          <w:lang w:eastAsia="es-ES"/>
+        </w:rPr>
+      </w:pPr>
+    </w:p>
+    <w:p>
+      <w:pPr>
+        <w:spacing w:after="0" w:line="300" w:lineRule="exact"/>
+        <w:rPr>
+          <w:rFonts w:ascii="Calibri" w:eastAsia="Times New Roman" w:hAnsi="Calibri" w:cs="Arial"/>
+          <w:lang w:eastAsia="es-ES"/>
+        </w:rPr>
+      </w:pPr>
+    </w:p>
+    <w:p>
+      <w:pPr>
+        <w:spacing w:after="0" w:line="300" w:lineRule="exact"/>
+        <w:rPr>
+          <w:rFonts w:ascii="Calibri" w:eastAsia="Times New Roman" w:hAnsi="Calibri" w:cs="Arial"/>
+          <w:lang w:eastAsia="es-ES"/>
+        </w:rPr>
+      </w:pPr>
+    </w:p>
+    <w:p>
+      <w:pPr>
+        <w:spacing w:after="0" w:line="300" w:lineRule="exact"/>
+        <w:rPr>
+          <w:rFonts w:ascii="Calibri" w:eastAsia="Times New Roman" w:hAnsi="Calibri" w:cs="Arial"/>
+          <w:lang w:eastAsia="es-ES"/>
+        </w:rPr>
+      </w:pPr>
+    </w:p>
+    <w:p>
+      <w:pPr>
+        <w:spacing w:after="0" w:line="300" w:lineRule="exact"/>
+        <w:rPr>
+          <w:rFonts w:ascii="Calibri" w:eastAsia="Times New Roman" w:hAnsi="Calibri" w:cs="Arial"/>
+          <w:lang w:eastAsia="es-ES"/>
+        </w:rPr>
+      </w:pPr>
     </w:p>
     <w:p>
       <w:pPr>
@@ -3153,7 +3444,7 @@
       <w:pPr>
         <w:pStyle w:val="Ttulo2"/>
       </w:pPr>
-      <w:bookmarkStart w:id="0" w:name="objetivo-general"/>
+      <w:bookmarkStart w:id="2" w:name="objetivo-general"/>
       <w:r>
         <w:t>Objetivo general</w:t>
       </w:r>
@@ -3240,7 +3531,7 @@
         <w:t>Evaluar el desempeño del sistema mediante simulaciones de interceptación y neutralización de drones hostiles, determinando las rutas de intercepción y la probabilidad de derribo.</w:t>
       </w:r>
     </w:p>
-    <w:bookmarkEnd w:id="0"/>
+    <w:bookmarkEnd w:id="2"/>
     <w:p>
       <w:pPr>
         <w:spacing w:line="240" w:lineRule="auto"/>
@@ -4688,23 +4979,7 @@
           <w:rFonts w:ascii="Calibri" w:eastAsia="Times New Roman" w:hAnsi="Calibri" w:cs="Arial"/>
           <w:lang w:eastAsia="es-ES"/>
         </w:rPr>
-        <w:t>La amenaza que motiva este trabajo se concentra en la Clase I, y en particular en sus subcategorías más ligeras. Por su tamaño, estos sistemas suelen ser portátiles, se lanzan a mano y los opera una sola persona, lo que permite emplearlos con gran rapidez (GlobalSecurity, [</w:t>
-      </w:r>
-      <w:bookmarkStart w:id="1" w:name="_GoBack"/>
-      <w:r>
-        <w:rPr>
-          <w:rFonts w:ascii="Calibri" w:eastAsia="Times New Roman" w:hAnsi="Calibri" w:cs="Arial"/>
-          <w:lang w:eastAsia="es-ES"/>
-        </w:rPr>
-        <w:t>año</w:t>
-      </w:r>
-      <w:bookmarkEnd w:id="1"/>
-      <w:r>
-        <w:rPr>
-          <w:rFonts w:ascii="Calibri" w:eastAsia="Times New Roman" w:hAnsi="Calibri" w:cs="Arial"/>
-          <w:lang w:eastAsia="es-ES"/>
-        </w:rPr>
-        <w:t>]). Se trata, en su mayoría, de drones comerciales de ala rotatoria, fáciles de adquirir y de operar, que vuelan a baja altitud y presentan una firma reducida frente a los sensores convencionales de defensa aérea.</w:t>
+        <w:t>La amenaza que motiva este trabajo se concentra en la Clase I, y en particular en sus subcategorías más ligeras. Por su tamaño, estos sistemas suelen ser portátiles, se lanzan a mano y los opera una sola persona, lo que permite emplearlos con gran rapidez (GlobalSecurity, [año]). Se trata, en su mayoría, de drones comerciales de ala rotatoria, fáciles de adquirir y de operar, que vuelan a baja altitud y presentan una firma reducida frente a los sensores convencionales de defensa aérea.</w:t>
       </w:r>
     </w:p>
     <w:p>
@@ -19973,7 +20248,7 @@
   <w:style w:type="paragraph" w:default="1" w:styleId="Normal">
     <w:name w:val="Normal"/>
     <w:qFormat/>
-    <w:rsid w:val="00E7310C"/>
+    <w:rsid w:val="007F6871"/>
   </w:style>
   <w:style w:type="paragraph" w:styleId="Ttulo2">
     <w:name w:val="heading 2"/>

</xml_diff>